<commit_message>
clearance second fix update
</commit_message>
<xml_diff>
--- a/backend/templates/FSED-34F-Hot-Works.docx
+++ b/backend/templates/FSED-34F-Hot-Works.docx
@@ -345,6 +345,182 @@
           <w:sz w:val="20"/>
         </w:rPr>
       </w:pPr>
+      <w:r>
+        <w:rPr>
+          <w:rFonts w:ascii="Arial" w:hAnsi="Arial" w:cs="Arial"/>
+          <w:sz w:val="24"/>
+          <w:szCs w:val="24"/>
+          <w:lang w:val="en-US" w:eastAsia="en-US"/>
+        </w:rPr>
+        <mc:AlternateContent>
+          <mc:Choice Requires="wps">
+            <w:drawing>
+              <wp:anchor distT="0" distB="0" distL="114300" distR="114300" simplePos="0" relativeHeight="251712512" behindDoc="0" locked="0" layoutInCell="1" allowOverlap="1">
+                <wp:simplePos x="0" y="0"/>
+                <wp:positionH relativeFrom="column">
+                  <wp:posOffset>264160</wp:posOffset>
+                </wp:positionH>
+                <wp:positionV relativeFrom="paragraph">
+                  <wp:posOffset>78740</wp:posOffset>
+                </wp:positionV>
+                <wp:extent cx="3861435" cy="342900"/>
+                <wp:effectExtent l="0" t="0" r="0" b="0"/>
+                <wp:wrapNone/>
+                <wp:docPr id="49" name="Text Box 49"/>
+                <wp:cNvGraphicFramePr/>
+                <a:graphic xmlns:a="http://schemas.openxmlformats.org/drawingml/2006/main">
+                  <a:graphicData uri="http://schemas.microsoft.com/office/word/2010/wordprocessingShape">
+                    <wps:wsp>
+                      <wps:cNvSpPr txBox="1"/>
+                      <wps:spPr>
+                        <a:xfrm>
+                          <a:off x="0" y="0"/>
+                          <a:ext cx="3861435" cy="342900"/>
+                        </a:xfrm>
+                        <a:prstGeom prst="rect">
+                          <a:avLst/>
+                        </a:prstGeom>
+                        <a:noFill/>
+                        <a:ln w="6350">
+                          <a:noFill/>
+                        </a:ln>
+                        <a:effectLst/>
+                      </wps:spPr>
+                      <wps:style>
+                        <a:lnRef idx="0">
+                          <a:schemeClr val="accent1"/>
+                        </a:lnRef>
+                        <a:fillRef idx="0">
+                          <a:schemeClr val="accent1"/>
+                        </a:fillRef>
+                        <a:effectRef idx="0">
+                          <a:schemeClr val="accent1"/>
+                        </a:effectRef>
+                        <a:fontRef idx="minor">
+                          <a:schemeClr val="dk1"/>
+                        </a:fontRef>
+                      </wps:style>
+                      <wps:txbx>
+                        <w:txbxContent>
+                          <w:p>
+                            <w:pPr>
+                              <w:spacing w:after="0" w:line="240" w:lineRule="auto"/>
+                              <w:jc w:val="center"/>
+                              <w:rPr>
+                                <w:rFonts w:hint="default" w:ascii="Arial Narrow" w:hAnsi="Arial Narrow" w:eastAsia="Times New Roman" w:cs="Arial Narrow"/>
+                                <w:b/>
+                                <w:bCs/>
+                                <w:color w:val="000000"/>
+                                <w:sz w:val="28"/>
+                                <w:szCs w:val="28"/>
+                                <w:lang w:val="en-US"/>
+                              </w:rPr>
+                            </w:pPr>
+                            <w:r>
+                              <w:rPr>
+                                <w:rFonts w:ascii="Arial Narrow" w:hAnsi="Arial Narrow" w:cs="Arial"/>
+                                <w:b/>
+                                <w:sz w:val="28"/>
+                                <w:szCs w:val="28"/>
+                              </w:rPr>
+                              <w:t>FSCHWO NO.</w:t>
+                            </w:r>
+                            <w:r>
+                              <w:rPr>
+                                <w:rFonts w:hint="default" w:ascii="Arial Narrow" w:hAnsi="Arial Narrow" w:cs="Arial"/>
+                                <w:b/>
+                                <w:sz w:val="28"/>
+                                <w:szCs w:val="28"/>
+                                <w:lang w:val="en-US"/>
+                              </w:rPr>
+                              <w:t xml:space="preserve"> </w:t>
+                            </w:r>
+                            <w:r>
+                              <w:rPr>
+                                <w:rFonts w:hint="default" w:ascii="Arial Narrow" w:hAnsi="Arial Narrow" w:eastAsia="Times New Roman" w:cs="Arial Narrow"/>
+                                <w:b/>
+                                <w:bCs/>
+                                <w:color w:val="000000"/>
+                                <w:sz w:val="28"/>
+                                <w:szCs w:val="28"/>
+                                <w:lang w:val="en-US"/>
+                              </w:rPr>
+                              <w:t>R10-STN5-{CONTROL_NUMBER}</w:t>
+                            </w:r>
+                          </w:p>
+                        </w:txbxContent>
+                      </wps:txbx>
+                      <wps:bodyPr rot="0" spcFirstLastPara="0" vertOverflow="overflow" horzOverflow="overflow" vert="horz" wrap="square" lIns="91440" tIns="45720" rIns="91440" bIns="45720" numCol="1" spcCol="0" rtlCol="0" fromWordArt="0" anchor="t" anchorCtr="0" forceAA="0" compatLnSpc="1">
+                        <a:noAutofit/>
+                      </wps:bodyPr>
+                    </wps:wsp>
+                  </a:graphicData>
+                </a:graphic>
+              </wp:anchor>
+            </w:drawing>
+          </mc:Choice>
+          <mc:Fallback>
+            <w:pict>
+              <v:shape id="_x0000_s1026" o:spid="_x0000_s1026" o:spt="202" type="#_x0000_t202" style="position:absolute;left:0pt;margin-left:20.8pt;margin-top:6.2pt;height:27pt;width:304.05pt;z-index:251712512;mso-width-relative:page;mso-height-relative:page;" filled="f" stroked="f" coordsize="21600,21600" o:gfxdata="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">
+                <v:fill on="f" focussize="0,0"/>
+                <v:stroke on="f" weight="0.5pt"/>
+                <v:imagedata o:title=""/>
+                <o:lock v:ext="edit" aspectratio="f"/>
+                <v:textbox>
+                  <w:txbxContent>
+                    <w:p>
+                      <w:pPr>
+                        <w:spacing w:after="0" w:line="240" w:lineRule="auto"/>
+                        <w:jc w:val="center"/>
+                        <w:rPr>
+                          <w:rFonts w:hint="default" w:ascii="Arial Narrow" w:hAnsi="Arial Narrow" w:eastAsia="Times New Roman" w:cs="Arial Narrow"/>
+                          <w:b/>
+                          <w:bCs/>
+                          <w:color w:val="000000"/>
+                          <w:sz w:val="28"/>
+                          <w:szCs w:val="28"/>
+                          <w:lang w:val="en-US"/>
+                        </w:rPr>
+                      </w:pPr>
+                      <w:r>
+                        <w:rPr>
+                          <w:rFonts w:ascii="Arial Narrow" w:hAnsi="Arial Narrow" w:cs="Arial"/>
+                          <w:b/>
+                          <w:sz w:val="28"/>
+                          <w:szCs w:val="28"/>
+                        </w:rPr>
+                        <w:t>FSCHWO NO.</w:t>
+                      </w:r>
+                      <w:r>
+                        <w:rPr>
+                          <w:rFonts w:hint="default" w:ascii="Arial Narrow" w:hAnsi="Arial Narrow" w:cs="Arial"/>
+                          <w:b/>
+                          <w:sz w:val="28"/>
+                          <w:szCs w:val="28"/>
+                          <w:lang w:val="en-US"/>
+                        </w:rPr>
+                        <w:t xml:space="preserve"> </w:t>
+                      </w:r>
+                      <w:r>
+                        <w:rPr>
+                          <w:rFonts w:hint="default" w:ascii="Arial Narrow" w:hAnsi="Arial Narrow" w:eastAsia="Times New Roman" w:cs="Arial Narrow"/>
+                          <w:b/>
+                          <w:bCs/>
+                          <w:color w:val="000000"/>
+                          <w:sz w:val="28"/>
+                          <w:szCs w:val="28"/>
+                          <w:lang w:val="en-US"/>
+                        </w:rPr>
+                        <w:t>R10-STN5-{CONTROL_NUMBER}</w:t>
+                      </w:r>
+                    </w:p>
+                  </w:txbxContent>
+                </v:textbox>
+              </v:shape>
+            </w:pict>
+          </mc:Fallback>
+        </mc:AlternateContent>
+      </w:r>
       <w:r>
         <w:rPr>
           <w:rFonts w:ascii="Arial" w:hAnsi="Arial" w:cs="Arial"/>
@@ -475,144 +651,6 @@
           </mc:Fallback>
         </mc:AlternateContent>
       </w:r>
-      <w:r>
-        <w:rPr>
-          <w:rFonts w:ascii="Arial" w:hAnsi="Arial" w:cs="Arial"/>
-          <w:sz w:val="24"/>
-          <w:szCs w:val="24"/>
-          <w:lang w:val="en-US" w:eastAsia="en-US"/>
-        </w:rPr>
-        <mc:AlternateContent>
-          <mc:Choice Requires="wps">
-            <w:drawing>
-              <wp:anchor distT="0" distB="0" distL="114300" distR="114300" simplePos="0" relativeHeight="251712512" behindDoc="0" locked="0" layoutInCell="1" allowOverlap="1">
-                <wp:simplePos x="0" y="0"/>
-                <wp:positionH relativeFrom="column">
-                  <wp:posOffset>1296670</wp:posOffset>
-                </wp:positionH>
-                <wp:positionV relativeFrom="paragraph">
-                  <wp:posOffset>80010</wp:posOffset>
-                </wp:positionV>
-                <wp:extent cx="2732405" cy="342900"/>
-                <wp:effectExtent l="0" t="0" r="0" b="0"/>
-                <wp:wrapNone/>
-                <wp:docPr id="49" name="Text Box 49"/>
-                <wp:cNvGraphicFramePr/>
-                <a:graphic xmlns:a="http://schemas.openxmlformats.org/drawingml/2006/main">
-                  <a:graphicData uri="http://schemas.microsoft.com/office/word/2010/wordprocessingShape">
-                    <wps:wsp>
-                      <wps:cNvSpPr txBox="1"/>
-                      <wps:spPr>
-                        <a:xfrm>
-                          <a:off x="0" y="0"/>
-                          <a:ext cx="2732405" cy="342900"/>
-                        </a:xfrm>
-                        <a:prstGeom prst="rect">
-                          <a:avLst/>
-                        </a:prstGeom>
-                        <a:noFill/>
-                        <a:ln w="6350">
-                          <a:noFill/>
-                        </a:ln>
-                        <a:effectLst/>
-                      </wps:spPr>
-                      <wps:style>
-                        <a:lnRef idx="0">
-                          <a:schemeClr val="accent1"/>
-                        </a:lnRef>
-                        <a:fillRef idx="0">
-                          <a:schemeClr val="accent1"/>
-                        </a:fillRef>
-                        <a:effectRef idx="0">
-                          <a:schemeClr val="accent1"/>
-                        </a:effectRef>
-                        <a:fontRef idx="minor">
-                          <a:schemeClr val="dk1"/>
-                        </a:fontRef>
-                      </wps:style>
-                      <wps:txbx>
-                        <w:txbxContent>
-                          <w:p>
-                            <w:pPr>
-                              <w:spacing w:after="0" w:line="240" w:lineRule="auto"/>
-                              <w:jc w:val="center"/>
-                              <w:rPr>
-                                <w:rFonts w:hint="default" w:ascii="Arial Narrow" w:hAnsi="Arial Narrow" w:eastAsia="Times New Roman" w:cs="Arial Narrow"/>
-                                <w:b/>
-                                <w:bCs/>
-                                <w:color w:val="000000"/>
-                                <w:sz w:val="28"/>
-                                <w:szCs w:val="28"/>
-                                <w:lang w:val="en-US"/>
-                              </w:rPr>
-                            </w:pPr>
-                            <w:r>
-                              <w:rPr>
-                                <w:rFonts w:hint="default" w:ascii="Arial Narrow" w:hAnsi="Arial Narrow" w:eastAsia="Times New Roman" w:cs="Arial Narrow"/>
-                                <w:b/>
-                                <w:bCs/>
-                                <w:color w:val="000000"/>
-                                <w:sz w:val="28"/>
-                                <w:szCs w:val="28"/>
-                                <w:lang w:val="en-US"/>
-                              </w:rPr>
-                              <w:t>R10-STN5-{CONTROL_NUMBER}</w:t>
-                            </w:r>
-                          </w:p>
-                        </w:txbxContent>
-                      </wps:txbx>
-                      <wps:bodyPr rot="0" spcFirstLastPara="0" vertOverflow="overflow" horzOverflow="overflow" vert="horz" wrap="square" lIns="91440" tIns="45720" rIns="91440" bIns="45720" numCol="1" spcCol="0" rtlCol="0" fromWordArt="0" anchor="t" anchorCtr="0" forceAA="0" compatLnSpc="1">
-                        <a:noAutofit/>
-                      </wps:bodyPr>
-                    </wps:wsp>
-                  </a:graphicData>
-                </a:graphic>
-              </wp:anchor>
-            </w:drawing>
-          </mc:Choice>
-          <mc:Fallback>
-            <w:pict>
-              <v:shape id="_x0000_s1026" o:spid="_x0000_s1026" o:spt="202" type="#_x0000_t202" style="position:absolute;left:0pt;margin-left:102.1pt;margin-top:6.3pt;height:27pt;width:215.15pt;z-index:251712512;mso-width-relative:page;mso-height-relative:page;" filled="f" stroked="f" coordsize="21600,21600" o:gfxdata="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">
-                <v:fill on="f" focussize="0,0"/>
-                <v:stroke on="f" weight="0.5pt"/>
-                <v:imagedata o:title=""/>
-                <o:lock v:ext="edit" aspectratio="f"/>
-                <v:textbox>
-                  <w:txbxContent>
-                    <w:p>
-                      <w:pPr>
-                        <w:spacing w:after="0" w:line="240" w:lineRule="auto"/>
-                        <w:jc w:val="center"/>
-                        <w:rPr>
-                          <w:rFonts w:hint="default" w:ascii="Arial Narrow" w:hAnsi="Arial Narrow" w:eastAsia="Times New Roman" w:cs="Arial Narrow"/>
-                          <w:b/>
-                          <w:bCs/>
-                          <w:color w:val="000000"/>
-                          <w:sz w:val="28"/>
-                          <w:szCs w:val="28"/>
-                          <w:lang w:val="en-US"/>
-                        </w:rPr>
-                      </w:pPr>
-                      <w:r>
-                        <w:rPr>
-                          <w:rFonts w:hint="default" w:ascii="Arial Narrow" w:hAnsi="Arial Narrow" w:eastAsia="Times New Roman" w:cs="Arial Narrow"/>
-                          <w:b/>
-                          <w:bCs/>
-                          <w:color w:val="000000"/>
-                          <w:sz w:val="28"/>
-                          <w:szCs w:val="28"/>
-                          <w:lang w:val="en-US"/>
-                        </w:rPr>
-                        <w:t>R10-STN5-{CONTROL_NUMBER}</w:t>
-                      </w:r>
-                    </w:p>
-                  </w:txbxContent>
-                </v:textbox>
-              </v:shape>
-            </w:pict>
-          </mc:Fallback>
-        </mc:AlternateContent>
-      </w:r>
     </w:p>
     <w:p>
       <w:pPr>
@@ -763,7 +801,7 @@
           <w:sz w:val="28"/>
           <w:szCs w:val="28"/>
         </w:rPr>
-        <w:t xml:space="preserve">    FSCHWO NO. </w:t>
+        <w:t xml:space="preserve">     </w:t>
       </w:r>
       <w:r>
         <w:rPr>
@@ -815,7 +853,15 @@
         <w:rPr>
           <w:rFonts w:ascii="Arial Narrow" w:hAnsi="Arial Narrow" w:cs="Arial"/>
         </w:rPr>
-        <w:t xml:space="preserve">                           </w:t>
+        <w:t xml:space="preserve">     </w:t>
+      </w:r>
+      <w:bookmarkStart w:id="0" w:name="_GoBack"/>
+      <w:bookmarkEnd w:id="0"/>
+      <w:r>
+        <w:rPr>
+          <w:rFonts w:ascii="Arial Narrow" w:hAnsi="Arial Narrow" w:cs="Arial"/>
+        </w:rPr>
+        <w:t xml:space="preserve">                      </w:t>
       </w:r>
     </w:p>
     <w:p>
@@ -7425,6 +7471,7 @@
     <w:p>
       <w:pPr>
         <w:spacing w:after="0" w:line="240" w:lineRule="auto"/>
+        <w:ind w:firstLine="720" w:firstLineChars="0"/>
         <w:jc w:val="both"/>
         <w:rPr>
           <w:rFonts w:ascii="Arial Narrow" w:hAnsi="Arial Narrow" w:cs="Arial"/>
@@ -7436,7 +7483,7 @@
     <w:p>
       <w:pPr>
         <w:spacing w:after="0" w:line="240" w:lineRule="auto"/>
-        <w:ind w:left="540"/>
+        <w:ind w:firstLine="720" w:firstLineChars="0"/>
         <w:rPr>
           <w:rFonts w:ascii="Arial" w:hAnsi="Arial" w:cs="Arial"/>
           <w:b/>
@@ -7448,14 +7495,14 @@
         <w:rPr>
           <w:rFonts w:ascii="Arial" w:hAnsi="Arial" w:cs="Arial"/>
           <w:b/>
-          <w:sz w:val="18"/>
-          <w:szCs w:val="18"/>
+          <w:sz w:val="20"/>
+          <w:szCs w:val="20"/>
         </w:rPr>
         <w:t>Fire Code Fees:</w:t>
       </w:r>
       <w:r>
         <w:rPr>
-          <w:rFonts w:ascii="Arial Narrow" w:hAnsi="Arial Narrow" w:cs="Arial"/>
+          <w:rFonts w:ascii="Arial" w:hAnsi="Arial" w:cs="Arial"/>
           <w:b/>
           <w:sz w:val="20"/>
           <w:szCs w:val="20"/>
@@ -7464,7 +7511,7 @@
       </w:r>
       <w:r>
         <w:rPr>
-          <w:rFonts w:ascii="Arial Narrow" w:hAnsi="Arial Narrow" w:cs="Arial"/>
+          <w:rFonts w:ascii="Arial" w:hAnsi="Arial" w:cs="Arial"/>
           <w:b/>
           <w:sz w:val="20"/>
           <w:szCs w:val="20"/>
@@ -7473,7 +7520,7 @@
       </w:r>
       <w:r>
         <w:rPr>
-          <w:rFonts w:ascii="Arial Narrow" w:hAnsi="Arial Narrow" w:cs="Arial"/>
+          <w:rFonts w:ascii="Arial" w:hAnsi="Arial" w:cs="Arial"/>
           <w:b/>
           <w:sz w:val="20"/>
           <w:szCs w:val="20"/>
@@ -7482,7 +7529,7 @@
       </w:r>
       <w:r>
         <w:rPr>
-          <w:rFonts w:ascii="Arial Narrow" w:hAnsi="Arial Narrow" w:cs="Arial"/>
+          <w:rFonts w:ascii="Arial" w:hAnsi="Arial" w:cs="Arial"/>
           <w:b/>
           <w:sz w:val="20"/>
           <w:szCs w:val="20"/>
@@ -7491,7 +7538,7 @@
       </w:r>
       <w:r>
         <w:rPr>
-          <w:rFonts w:ascii="Arial Narrow" w:hAnsi="Arial Narrow" w:cs="Arial"/>
+          <w:rFonts w:ascii="Arial" w:hAnsi="Arial" w:cs="Arial"/>
           <w:b/>
           <w:sz w:val="20"/>
           <w:szCs w:val="20"/>
@@ -7500,98 +7547,372 @@
       </w:r>
       <w:r>
         <w:rPr>
-          <w:rFonts w:ascii="Arial Narrow" w:hAnsi="Arial Narrow" w:cs="Arial"/>
+          <w:rFonts w:ascii="Arial" w:hAnsi="Arial" w:cs="Arial"/>
           <w:b/>
           <w:sz w:val="20"/>
           <w:szCs w:val="20"/>
         </w:rPr>
-        <w:tab/>
-      </w:r>
-      <w:r>
-        <w:rPr>
-          <w:rFonts w:ascii="Arial Narrow" w:hAnsi="Arial Narrow" w:cs="Arial"/>
-          <w:b/>
-          <w:sz w:val="20"/>
-          <w:szCs w:val="20"/>
-        </w:rPr>
-        <w:tab/>
-      </w:r>
-      <w:r>
-        <w:rPr>
-          <w:rFonts w:ascii="Arial" w:hAnsi="Arial" w:cs="Arial"/>
-          <w:b/>
-          <w:sz w:val="20"/>
-          <w:szCs w:val="20"/>
-        </w:rPr>
-        <w:t>RECOMMEND APPROVAL:</w:t>
+        <w:t xml:space="preserve">     RECOMMEND APPROVAL:</w:t>
       </w:r>
     </w:p>
     <w:p>
       <w:pPr>
         <w:spacing w:after="0" w:line="240" w:lineRule="auto"/>
-        <w:ind w:left="540"/>
+        <w:ind w:firstLine="720" w:firstLineChars="0"/>
         <w:rPr>
           <w:rFonts w:ascii="Arial" w:hAnsi="Arial" w:cs="Arial"/>
           <w:b/>
-          <w:sz w:val="18"/>
-          <w:szCs w:val="18"/>
+          <w:sz w:val="20"/>
+          <w:szCs w:val="20"/>
         </w:rPr>
       </w:pPr>
       <w:r>
         <w:rPr>
           <w:rFonts w:ascii="Arial" w:hAnsi="Arial" w:cs="Arial"/>
-          <w:sz w:val="18"/>
-          <w:szCs w:val="18"/>
+          <w:sz w:val="24"/>
+          <w:szCs w:val="24"/>
+          <w:lang w:val="en-US" w:eastAsia="en-US"/>
+        </w:rPr>
+        <mc:AlternateContent>
+          <mc:Choice Requires="wps">
+            <w:drawing>
+              <wp:anchor distT="0" distB="0" distL="114300" distR="114300" simplePos="0" relativeHeight="251719680" behindDoc="0" locked="0" layoutInCell="1" allowOverlap="1">
+                <wp:simplePos x="0" y="0"/>
+                <wp:positionH relativeFrom="column">
+                  <wp:posOffset>1210945</wp:posOffset>
+                </wp:positionH>
+                <wp:positionV relativeFrom="paragraph">
+                  <wp:posOffset>147955</wp:posOffset>
+                </wp:positionV>
+                <wp:extent cx="1314450" cy="0"/>
+                <wp:effectExtent l="0" t="4445" r="0" b="5080"/>
+                <wp:wrapNone/>
+                <wp:docPr id="1694765211" name="Straight Connector 22"/>
+                <wp:cNvGraphicFramePr/>
+                <a:graphic xmlns:a="http://schemas.openxmlformats.org/drawingml/2006/main">
+                  <a:graphicData uri="http://schemas.microsoft.com/office/word/2010/wordprocessingShape">
+                    <wps:wsp>
+                      <wps:cNvCnPr/>
+                      <wps:spPr>
+                        <a:xfrm>
+                          <a:off x="0" y="0"/>
+                          <a:ext cx="1314450" cy="0"/>
+                        </a:xfrm>
+                        <a:prstGeom prst="line">
+                          <a:avLst/>
+                        </a:prstGeom>
+                      </wps:spPr>
+                      <wps:style>
+                        <a:lnRef idx="1">
+                          <a:schemeClr val="dk1"/>
+                        </a:lnRef>
+                        <a:fillRef idx="0">
+                          <a:schemeClr val="dk1"/>
+                        </a:fillRef>
+                        <a:effectRef idx="0">
+                          <a:schemeClr val="dk1"/>
+                        </a:effectRef>
+                        <a:fontRef idx="minor">
+                          <a:schemeClr val="tx1"/>
+                        </a:fontRef>
+                      </wps:style>
+                      <wps:bodyPr/>
+                    </wps:wsp>
+                  </a:graphicData>
+                </a:graphic>
+              </wp:anchor>
+            </w:drawing>
+          </mc:Choice>
+          <mc:Fallback>
+            <w:pict>
+              <v:line id="Straight Connector 22" o:spid="_x0000_s1026" o:spt="20" style="position:absolute;left:0pt;margin-left:95.35pt;margin-top:11.65pt;height:0pt;width:103.5pt;z-index:251719680;mso-width-relative:page;mso-height-relative:page;" filled="f" stroked="t" coordsize="21600,21600" o:gfxdata="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">
+                <v:fill on="f" focussize="0,0"/>
+                <v:stroke color="#000000 [3200]" joinstyle="round"/>
+                <v:imagedata o:title=""/>
+                <o:lock v:ext="edit" aspectratio="f"/>
+              </v:line>
+            </w:pict>
+          </mc:Fallback>
+        </mc:AlternateContent>
+      </w:r>
+      <w:r>
+        <w:rPr>
+          <w:rFonts w:ascii="Arial" w:hAnsi="Arial" w:cs="Arial"/>
+          <w:sz w:val="24"/>
+          <w:szCs w:val="24"/>
+          <w:lang w:val="en-US" w:eastAsia="en-US"/>
+        </w:rPr>
+        <mc:AlternateContent>
+          <mc:Choice Requires="wps">
+            <w:drawing>
+              <wp:anchor distT="0" distB="0" distL="114300" distR="114300" simplePos="0" relativeHeight="251718656" behindDoc="1" locked="0" layoutInCell="1" allowOverlap="1">
+                <wp:simplePos x="0" y="0"/>
+                <wp:positionH relativeFrom="column">
+                  <wp:posOffset>3057525</wp:posOffset>
+                </wp:positionH>
+                <wp:positionV relativeFrom="paragraph">
+                  <wp:posOffset>52705</wp:posOffset>
+                </wp:positionV>
+                <wp:extent cx="3061970" cy="486410"/>
+                <wp:effectExtent l="0" t="0" r="0" b="0"/>
+                <wp:wrapNone/>
+                <wp:docPr id="61" name="Text Box 61"/>
+                <wp:cNvGraphicFramePr/>
+                <a:graphic xmlns:a="http://schemas.openxmlformats.org/drawingml/2006/main">
+                  <a:graphicData uri="http://schemas.microsoft.com/office/word/2010/wordprocessingShape">
+                    <wps:wsp>
+                      <wps:cNvSpPr txBox="1"/>
+                      <wps:spPr>
+                        <a:xfrm>
+                          <a:off x="0" y="0"/>
+                          <a:ext cx="3061970" cy="486410"/>
+                        </a:xfrm>
+                        <a:prstGeom prst="rect">
+                          <a:avLst/>
+                        </a:prstGeom>
+                        <a:noFill/>
+                        <a:ln w="6350">
+                          <a:noFill/>
+                        </a:ln>
+                        <a:effectLst/>
+                      </wps:spPr>
+                      <wps:style>
+                        <a:lnRef idx="0">
+                          <a:schemeClr val="accent1"/>
+                        </a:lnRef>
+                        <a:fillRef idx="0">
+                          <a:schemeClr val="accent1"/>
+                        </a:fillRef>
+                        <a:effectRef idx="0">
+                          <a:schemeClr val="accent1"/>
+                        </a:effectRef>
+                        <a:fontRef idx="minor">
+                          <a:schemeClr val="dk1"/>
+                        </a:fontRef>
+                      </wps:style>
+                      <wps:txbx>
+                        <w:txbxContent>
+                          <w:p>
+                            <w:pPr>
+                              <w:spacing w:after="0" w:afterLines="31" w:afterAutospacing="0" w:line="240" w:lineRule="auto"/>
+                              <w:jc w:val="center"/>
+                              <w:rPr>
+                                <w:rFonts w:hint="default" w:ascii="Arial" w:hAnsi="Arial" w:cs="Arial"/>
+                                <w:b/>
+                                <w:bCs/>
+                                <w:sz w:val="20"/>
+                                <w:szCs w:val="20"/>
+                                <w:u w:val="none"/>
+                                <w:lang w:val="en-US"/>
+                              </w:rPr>
+                            </w:pPr>
+                            <w:r>
+                              <w:rPr>
+                                <w:rFonts w:hint="default" w:ascii="Arial" w:hAnsi="Arial" w:cs="Arial"/>
+                                <w:b/>
+                                <w:bCs/>
+                                <w:sz w:val="20"/>
+                                <w:szCs w:val="20"/>
+                                <w:u w:val="none"/>
+                                <w:lang w:val="en-US"/>
+                              </w:rPr>
+                              <w:t>{CHIEF}</w:t>
+                            </w:r>
+                          </w:p>
+                          <w:p>
+                            <w:pPr>
+                              <w:jc w:val="center"/>
+                              <w:rPr>
+                                <w:rFonts w:hint="default" w:ascii="Arial" w:hAnsi="Arial" w:cs="Arial"/>
+                                <w:b/>
+                                <w:sz w:val="20"/>
+                                <w:szCs w:val="20"/>
+                              </w:rPr>
+                            </w:pPr>
+                            <w:r>
+                              <w:rPr>
+                                <w:rFonts w:hint="default" w:ascii="Arial" w:hAnsi="Arial" w:eastAsia="SimSun" w:cs="Arial"/>
+                                <w:sz w:val="20"/>
+                                <w:szCs w:val="20"/>
+                              </w:rPr>
+                              <w:t>{CHIEF_POSITION}</w:t>
+                            </w:r>
+                          </w:p>
+                          <w:p>
+                            <w:pPr>
+                              <w:spacing w:beforeAutospacing="0" w:after="0" w:afterAutospacing="0" w:line="240" w:lineRule="auto"/>
+                              <w:jc w:val="center"/>
+                              <w:rPr>
+                                <w:rFonts w:cstheme="minorHAnsi"/>
+                                <w:b/>
+                                <w:u w:val="single"/>
+                              </w:rPr>
+                            </w:pPr>
+                          </w:p>
+                        </w:txbxContent>
+                      </wps:txbx>
+                      <wps:bodyPr rot="0" spcFirstLastPara="0" vertOverflow="overflow" horzOverflow="overflow" vert="horz" wrap="square" lIns="91440" tIns="45720" rIns="91440" bIns="45720" numCol="1" spcCol="0" rtlCol="0" fromWordArt="0" anchor="t" anchorCtr="0" forceAA="0" compatLnSpc="1">
+                        <a:noAutofit/>
+                      </wps:bodyPr>
+                    </wps:wsp>
+                  </a:graphicData>
+                </a:graphic>
+              </wp:anchor>
+            </w:drawing>
+          </mc:Choice>
+          <mc:Fallback>
+            <w:pict>
+              <v:shape id="_x0000_s1026" o:spid="_x0000_s1026" o:spt="202" type="#_x0000_t202" style="position:absolute;left:0pt;margin-left:240.75pt;margin-top:4.15pt;height:38.3pt;width:241.1pt;z-index:-251597824;mso-width-relative:page;mso-height-relative:page;" filled="f" stroked="f" coordsize="21600,21600" o:gfxdata="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">
+                <v:fill on="f" focussize="0,0"/>
+                <v:stroke on="f" weight="0.5pt"/>
+                <v:imagedata o:title=""/>
+                <o:lock v:ext="edit" aspectratio="f"/>
+                <v:textbox>
+                  <w:txbxContent>
+                    <w:p>
+                      <w:pPr>
+                        <w:spacing w:after="0" w:afterLines="31" w:afterAutospacing="0" w:line="240" w:lineRule="auto"/>
+                        <w:jc w:val="center"/>
+                        <w:rPr>
+                          <w:rFonts w:hint="default" w:ascii="Arial" w:hAnsi="Arial" w:cs="Arial"/>
+                          <w:b/>
+                          <w:bCs/>
+                          <w:sz w:val="20"/>
+                          <w:szCs w:val="20"/>
+                          <w:u w:val="none"/>
+                          <w:lang w:val="en-US"/>
+                        </w:rPr>
+                      </w:pPr>
+                      <w:r>
+                        <w:rPr>
+                          <w:rFonts w:hint="default" w:ascii="Arial" w:hAnsi="Arial" w:cs="Arial"/>
+                          <w:b/>
+                          <w:bCs/>
+                          <w:sz w:val="20"/>
+                          <w:szCs w:val="20"/>
+                          <w:u w:val="none"/>
+                          <w:lang w:val="en-US"/>
+                        </w:rPr>
+                        <w:t>{CHIEF}</w:t>
+                      </w:r>
+                    </w:p>
+                    <w:p>
+                      <w:pPr>
+                        <w:jc w:val="center"/>
+                        <w:rPr>
+                          <w:rFonts w:hint="default" w:ascii="Arial" w:hAnsi="Arial" w:cs="Arial"/>
+                          <w:b/>
+                          <w:sz w:val="20"/>
+                          <w:szCs w:val="20"/>
+                        </w:rPr>
+                      </w:pPr>
+                      <w:r>
+                        <w:rPr>
+                          <w:rFonts w:hint="default" w:ascii="Arial" w:hAnsi="Arial" w:eastAsia="SimSun" w:cs="Arial"/>
+                          <w:sz w:val="20"/>
+                          <w:szCs w:val="20"/>
+                        </w:rPr>
+                        <w:t>{CHIEF_POSITION}</w:t>
+                      </w:r>
+                    </w:p>
+                    <w:p>
+                      <w:pPr>
+                        <w:spacing w:beforeAutospacing="0" w:after="0" w:afterAutospacing="0" w:line="240" w:lineRule="auto"/>
+                        <w:jc w:val="center"/>
+                        <w:rPr>
+                          <w:rFonts w:cstheme="minorHAnsi"/>
+                          <w:b/>
+                          <w:u w:val="single"/>
+                        </w:rPr>
+                      </w:pPr>
+                    </w:p>
+                  </w:txbxContent>
+                </v:textbox>
+              </v:shape>
+            </w:pict>
+          </mc:Fallback>
+        </mc:AlternateContent>
+      </w:r>
+      <w:r>
+        <w:rPr>
+          <w:rFonts w:ascii="Arial" w:hAnsi="Arial" w:cs="Arial"/>
+          <w:sz w:val="20"/>
+          <w:szCs w:val="20"/>
         </w:rPr>
         <w:t xml:space="preserve">Amount Paid: </w:t>
       </w:r>
       <w:r>
         <w:rPr>
-          <w:rFonts w:hint="default" w:ascii="Arial" w:hAnsi="Arial" w:cs="Arial"/>
-          <w:sz w:val="18"/>
-          <w:szCs w:val="18"/>
-          <w:u w:val="single"/>
+          <w:rFonts w:ascii="Helvetica" w:hAnsi="Helvetica" w:eastAsia="Helvetica" w:cs="Helvetica"/>
+          <w:b w:val="0"/>
+          <w:bCs w:val="0"/>
+          <w:i w:val="0"/>
+          <w:iCs w:val="0"/>
+          <w:caps w:val="0"/>
+          <w:color w:val="000000" w:themeColor="text1"/>
+          <w:spacing w:val="0"/>
+          <w:sz w:val="22"/>
+          <w:szCs w:val="22"/>
+          <w:shd w:val="clear" w:fill="FFFFFF"/>
+          <w14:textFill>
+            <w14:solidFill>
+              <w14:schemeClr w14:val="tx1"/>
+            </w14:solidFill>
+          </w14:textFill>
+        </w:rPr>
+        <w:t>₱</w:t>
+      </w:r>
+      <w:r>
+        <w:rPr>
+          <w:rFonts w:hint="default" w:ascii="Helvetica" w:hAnsi="Helvetica" w:eastAsia="Helvetica" w:cs="Helvetica"/>
+          <w:b w:val="0"/>
+          <w:bCs w:val="0"/>
+          <w:i w:val="0"/>
+          <w:iCs w:val="0"/>
+          <w:caps w:val="0"/>
+          <w:color w:val="000000" w:themeColor="text1"/>
+          <w:spacing w:val="0"/>
+          <w:sz w:val="22"/>
+          <w:szCs w:val="22"/>
+          <w:shd w:val="clear" w:fill="FFFFFF"/>
           <w:lang w:val="en-US"/>
-        </w:rPr>
-        <w:t xml:space="preserve">  {AMOUNT_PAID}</w:t>
-      </w:r>
-      <w:r>
-        <w:rPr>
-          <w:rFonts w:ascii="Arial" w:hAnsi="Arial" w:cs="Arial"/>
-          <w:sz w:val="18"/>
-          <w:szCs w:val="18"/>
+          <w14:textFill>
+            <w14:solidFill>
+              <w14:schemeClr w14:val="tx1"/>
+            </w14:solidFill>
+          </w14:textFill>
+        </w:rPr>
+        <w:t xml:space="preserve"> {OR_AMOUNT}</w:t>
+      </w:r>
+      <w:r>
+        <w:rPr>
+          <w:rFonts w:ascii="Arial" w:hAnsi="Arial" w:cs="Arial"/>
+          <w:sz w:val="20"/>
+          <w:szCs w:val="20"/>
         </w:rPr>
         <w:tab/>
       </w:r>
       <w:r>
         <w:rPr>
           <w:rFonts w:ascii="Arial" w:hAnsi="Arial" w:cs="Arial"/>
-          <w:sz w:val="18"/>
-          <w:szCs w:val="18"/>
+          <w:sz w:val="20"/>
+          <w:szCs w:val="20"/>
         </w:rPr>
         <w:tab/>
       </w:r>
       <w:r>
         <w:rPr>
           <w:rFonts w:ascii="Arial" w:hAnsi="Arial" w:cs="Arial"/>
-          <w:sz w:val="18"/>
-          <w:szCs w:val="18"/>
+          <w:sz w:val="20"/>
+          <w:szCs w:val="20"/>
         </w:rPr>
         <w:tab/>
       </w:r>
       <w:r>
         <w:rPr>
           <w:rFonts w:ascii="Arial" w:hAnsi="Arial" w:cs="Arial"/>
-          <w:sz w:val="18"/>
-          <w:szCs w:val="18"/>
-        </w:rPr>
-        <w:tab/>
-      </w:r>
-      <w:r>
-        <w:rPr>
-          <w:rFonts w:ascii="Arial" w:hAnsi="Arial" w:cs="Arial"/>
-          <w:sz w:val="18"/>
-          <w:szCs w:val="18"/>
+          <w:sz w:val="20"/>
+          <w:szCs w:val="20"/>
         </w:rPr>
         <w:t xml:space="preserve"> </w:t>
       </w:r>
@@ -7599,183 +7920,431 @@
     <w:p>
       <w:pPr>
         <w:spacing w:after="0" w:line="240" w:lineRule="auto"/>
-        <w:ind w:left="540"/>
-        <w:rPr>
-          <w:rFonts w:ascii="Arial" w:hAnsi="Arial" w:cs="Arial"/>
-          <w:sz w:val="18"/>
-          <w:szCs w:val="18"/>
-          <w:u w:val="single"/>
+        <w:ind w:firstLine="720" w:firstLineChars="0"/>
+        <w:rPr>
+          <w:rFonts w:ascii="Arial" w:hAnsi="Arial" w:cs="Arial"/>
+          <w:sz w:val="20"/>
+          <w:szCs w:val="20"/>
         </w:rPr>
       </w:pPr>
       <w:r>
         <w:rPr>
           <w:rFonts w:ascii="Arial" w:hAnsi="Arial" w:cs="Arial"/>
-          <w:sz w:val="18"/>
-          <w:szCs w:val="18"/>
-        </w:rPr>
-        <w:t xml:space="preserve">O.R. Number: </w:t>
+          <w:sz w:val="24"/>
+          <w:szCs w:val="24"/>
+          <w:lang w:val="en-US" w:eastAsia="en-US"/>
+        </w:rPr>
+        <mc:AlternateContent>
+          <mc:Choice Requires="wps">
+            <w:drawing>
+              <wp:anchor distT="0" distB="0" distL="114300" distR="114300" simplePos="0" relativeHeight="251720704" behindDoc="0" locked="0" layoutInCell="1" allowOverlap="1">
+                <wp:simplePos x="0" y="0"/>
+                <wp:positionH relativeFrom="column">
+                  <wp:posOffset>735330</wp:posOffset>
+                </wp:positionH>
+                <wp:positionV relativeFrom="paragraph">
+                  <wp:posOffset>146050</wp:posOffset>
+                </wp:positionV>
+                <wp:extent cx="1314450" cy="0"/>
+                <wp:effectExtent l="0" t="4445" r="0" b="5080"/>
+                <wp:wrapNone/>
+                <wp:docPr id="1094408323" name="Straight Connector 22"/>
+                <wp:cNvGraphicFramePr/>
+                <a:graphic xmlns:a="http://schemas.openxmlformats.org/drawingml/2006/main">
+                  <a:graphicData uri="http://schemas.microsoft.com/office/word/2010/wordprocessingShape">
+                    <wps:wsp>
+                      <wps:cNvCnPr/>
+                      <wps:spPr>
+                        <a:xfrm>
+                          <a:off x="0" y="0"/>
+                          <a:ext cx="1314450" cy="0"/>
+                        </a:xfrm>
+                        <a:prstGeom prst="line">
+                          <a:avLst/>
+                        </a:prstGeom>
+                      </wps:spPr>
+                      <wps:style>
+                        <a:lnRef idx="1">
+                          <a:schemeClr val="dk1"/>
+                        </a:lnRef>
+                        <a:fillRef idx="0">
+                          <a:schemeClr val="dk1"/>
+                        </a:fillRef>
+                        <a:effectRef idx="0">
+                          <a:schemeClr val="dk1"/>
+                        </a:effectRef>
+                        <a:fontRef idx="minor">
+                          <a:schemeClr val="tx1"/>
+                        </a:fontRef>
+                      </wps:style>
+                      <wps:bodyPr/>
+                    </wps:wsp>
+                  </a:graphicData>
+                </a:graphic>
+              </wp:anchor>
+            </w:drawing>
+          </mc:Choice>
+          <mc:Fallback>
+            <w:pict>
+              <v:line id="Straight Connector 22" o:spid="_x0000_s1026" o:spt="20" style="position:absolute;left:0pt;margin-left:57.9pt;margin-top:11.5pt;height:0pt;width:103.5pt;z-index:251720704;mso-width-relative:page;mso-height-relative:page;" filled="f" stroked="t" coordsize="21600,21600" o:gfxdata="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">
+                <v:fill on="f" focussize="0,0"/>
+                <v:stroke color="#000000 [3200]" joinstyle="round"/>
+                <v:imagedata o:title=""/>
+                <o:lock v:ext="edit" aspectratio="f"/>
+              </v:line>
+            </w:pict>
+          </mc:Fallback>
+        </mc:AlternateContent>
+      </w:r>
+      <w:r>
+        <w:rPr>
+          <w:rFonts w:ascii="Arial" w:hAnsi="Arial" w:cs="Arial"/>
+          <w:sz w:val="24"/>
+          <w:szCs w:val="24"/>
+          <w:lang w:val="en-US" w:eastAsia="en-US"/>
+        </w:rPr>
+        <mc:AlternateContent>
+          <mc:Choice Requires="wps">
+            <w:drawing>
+              <wp:anchor distT="0" distB="0" distL="114300" distR="114300" simplePos="0" relativeHeight="251722752" behindDoc="0" locked="0" layoutInCell="1" allowOverlap="1">
+                <wp:simplePos x="0" y="0"/>
+                <wp:positionH relativeFrom="column">
+                  <wp:posOffset>3418840</wp:posOffset>
+                </wp:positionH>
+                <wp:positionV relativeFrom="paragraph">
+                  <wp:posOffset>78740</wp:posOffset>
+                </wp:positionV>
+                <wp:extent cx="2308225" cy="10795"/>
+                <wp:effectExtent l="0" t="4445" r="15875" b="13335"/>
+                <wp:wrapNone/>
+                <wp:docPr id="62" name="Straight Connector 22"/>
+                <wp:cNvGraphicFramePr/>
+                <a:graphic xmlns:a="http://schemas.openxmlformats.org/drawingml/2006/main">
+                  <a:graphicData uri="http://schemas.microsoft.com/office/word/2010/wordprocessingShape">
+                    <wps:wsp>
+                      <wps:cNvCnPr/>
+                      <wps:spPr>
+                        <a:xfrm flipV="1">
+                          <a:off x="0" y="0"/>
+                          <a:ext cx="2308225" cy="10795"/>
+                        </a:xfrm>
+                        <a:prstGeom prst="line">
+                          <a:avLst/>
+                        </a:prstGeom>
+                      </wps:spPr>
+                      <wps:style>
+                        <a:lnRef idx="1">
+                          <a:schemeClr val="dk1"/>
+                        </a:lnRef>
+                        <a:fillRef idx="0">
+                          <a:schemeClr val="dk1"/>
+                        </a:fillRef>
+                        <a:effectRef idx="0">
+                          <a:schemeClr val="dk1"/>
+                        </a:effectRef>
+                        <a:fontRef idx="minor">
+                          <a:schemeClr val="tx1"/>
+                        </a:fontRef>
+                      </wps:style>
+                      <wps:bodyPr/>
+                    </wps:wsp>
+                  </a:graphicData>
+                </a:graphic>
+              </wp:anchor>
+            </w:drawing>
+          </mc:Choice>
+          <mc:Fallback>
+            <w:pict>
+              <v:line id="Straight Connector 22" o:spid="_x0000_s1026" o:spt="20" style="position:absolute;left:0pt;flip:y;margin-left:269.2pt;margin-top:6.2pt;height:0.85pt;width:181.75pt;z-index:251722752;mso-width-relative:page;mso-height-relative:page;" filled="f" stroked="t" coordsize="21600,21600" o:gfxdata="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">
+                <v:fill on="f" focussize="0,0"/>
+                <v:stroke color="#000000 [3200]" joinstyle="round"/>
+                <v:imagedata o:title=""/>
+                <o:lock v:ext="edit" aspectratio="f"/>
+              </v:line>
+            </w:pict>
+          </mc:Fallback>
+        </mc:AlternateContent>
+      </w:r>
+      <w:r>
+        <w:rPr>
+          <w:rFonts w:ascii="Arial" w:hAnsi="Arial" w:cs="Arial"/>
+          <w:sz w:val="20"/>
+          <w:szCs w:val="20"/>
+        </w:rPr>
+        <w:t xml:space="preserve">O.R. Number:   </w:t>
+      </w:r>
+      <w:r>
+        <w:rPr>
+          <w:rFonts w:ascii="Arial" w:hAnsi="Arial" w:cs="Arial"/>
+          <w:sz w:val="20"/>
+          <w:szCs w:val="20"/>
+        </w:rPr>
+        <w:fldChar w:fldCharType="begin"/>
+      </w:r>
+      <w:r>
+        <w:rPr>
+          <w:rFonts w:ascii="Arial" w:hAnsi="Arial" w:cs="Arial"/>
+          <w:sz w:val="20"/>
+          <w:szCs w:val="20"/>
+        </w:rPr>
+        <w:instrText xml:space="preserve"> MERGEFIELD OR_NUMBER </w:instrText>
+      </w:r>
+      <w:r>
+        <w:rPr>
+          <w:rFonts w:ascii="Arial" w:hAnsi="Arial" w:cs="Arial"/>
+          <w:sz w:val="20"/>
+          <w:szCs w:val="20"/>
+        </w:rPr>
+        <w:fldChar w:fldCharType="separate"/>
       </w:r>
       <w:r>
         <w:rPr>
           <w:rFonts w:hint="default" w:ascii="Arial" w:hAnsi="Arial" w:cs="Arial"/>
-          <w:sz w:val="18"/>
-          <w:szCs w:val="18"/>
-          <w:u w:val="single"/>
+          <w:sz w:val="20"/>
+          <w:szCs w:val="20"/>
           <w:lang w:val="en-US"/>
         </w:rPr>
-        <w:t xml:space="preserve">  {OR_NUMBER}</w:t>
+        <w:t>{</w:t>
+      </w:r>
+      <w:r>
+        <w:rPr>
+          <w:rFonts w:ascii="Arial" w:hAnsi="Arial" w:cs="Arial"/>
+          <w:sz w:val="20"/>
+          <w:szCs w:val="20"/>
+        </w:rPr>
+        <w:t>OR_NUMBER</w:t>
+      </w:r>
+      <w:r>
+        <w:rPr>
+          <w:rFonts w:hint="default" w:ascii="Arial" w:hAnsi="Arial" w:cs="Arial"/>
+          <w:sz w:val="20"/>
+          <w:szCs w:val="20"/>
+          <w:lang w:val="en-US"/>
+        </w:rPr>
+        <w:t>}</w:t>
+      </w:r>
+      <w:r>
+        <w:rPr>
+          <w:rFonts w:ascii="Arial" w:hAnsi="Arial" w:cs="Arial"/>
+          <w:sz w:val="20"/>
+          <w:szCs w:val="20"/>
+        </w:rPr>
+        <w:fldChar w:fldCharType="end"/>
+      </w:r>
+      <w:r>
+        <w:rPr>
+          <w:rFonts w:ascii="Arial" w:hAnsi="Arial" w:cs="Arial"/>
+          <w:sz w:val="20"/>
+          <w:szCs w:val="20"/>
+        </w:rPr>
+        <w:tab/>
+      </w:r>
+      <w:r>
+        <w:rPr>
+          <w:rFonts w:ascii="Arial" w:hAnsi="Arial" w:cs="Arial"/>
+          <w:sz w:val="20"/>
+          <w:szCs w:val="20"/>
+        </w:rPr>
+        <w:tab/>
       </w:r>
     </w:p>
     <w:p>
       <w:pPr>
         <w:spacing w:after="0" w:line="240" w:lineRule="auto"/>
-        <w:ind w:left="540"/>
-        <w:rPr>
-          <w:rFonts w:ascii="Arial" w:hAnsi="Arial" w:cs="Arial"/>
-          <w:sz w:val="18"/>
-          <w:szCs w:val="18"/>
-          <w:u w:val="single"/>
+        <w:ind w:firstLine="720" w:firstLineChars="0"/>
+        <w:rPr>
+          <w:rFonts w:ascii="Arial" w:hAnsi="Arial" w:cs="Arial"/>
+          <w:sz w:val="20"/>
+          <w:szCs w:val="20"/>
         </w:rPr>
       </w:pPr>
       <w:r>
         <w:rPr>
           <w:rFonts w:ascii="Arial" w:hAnsi="Arial" w:cs="Arial"/>
-          <w:sz w:val="18"/>
-          <w:szCs w:val="18"/>
+          <w:sz w:val="20"/>
+          <w:szCs w:val="20"/>
         </w:rPr>
         <w:t xml:space="preserve">Date: </w:t>
       </w:r>
       <w:r>
         <w:rPr>
+          <w:rFonts w:ascii="Arial" w:hAnsi="Arial" w:cs="Arial"/>
+          <w:sz w:val="20"/>
+          <w:szCs w:val="20"/>
+        </w:rPr>
+        <w:fldChar w:fldCharType="begin"/>
+      </w:r>
+      <w:r>
+        <w:rPr>
+          <w:rFonts w:ascii="Arial" w:hAnsi="Arial" w:cs="Arial"/>
+          <w:sz w:val="20"/>
+          <w:szCs w:val="20"/>
+        </w:rPr>
+        <w:instrText xml:space="preserve"> MERGEFIELD OR_DATE </w:instrText>
+      </w:r>
+      <w:r>
+        <w:rPr>
+          <w:rFonts w:ascii="Arial" w:hAnsi="Arial" w:cs="Arial"/>
+          <w:sz w:val="20"/>
+          <w:szCs w:val="20"/>
+        </w:rPr>
+        <w:fldChar w:fldCharType="separate"/>
+      </w:r>
+      <w:r>
+        <w:rPr>
           <w:rFonts w:hint="default" w:ascii="Arial" w:hAnsi="Arial" w:cs="Arial"/>
-          <w:sz w:val="18"/>
-          <w:szCs w:val="18"/>
-          <w:u w:val="single"/>
+          <w:sz w:val="20"/>
+          <w:szCs w:val="20"/>
           <w:lang w:val="en-US"/>
         </w:rPr>
-        <w:t xml:space="preserve">  {OR_DATE}</w:t>
-      </w:r>
-      <w:r>
-        <w:rPr>
-          <w:rFonts w:ascii="Arial" w:hAnsi="Arial" w:cs="Arial"/>
-          <w:sz w:val="18"/>
-          <w:szCs w:val="18"/>
-          <w:u w:val="single"/>
+        <w:t>{</w:t>
+      </w:r>
+      <w:r>
+        <w:rPr>
+          <w:rFonts w:ascii="Arial" w:hAnsi="Arial" w:cs="Arial"/>
+          <w:sz w:val="20"/>
+          <w:szCs w:val="20"/>
+        </w:rPr>
+        <w:t>OR_DATE</w:t>
+      </w:r>
+      <w:r>
+        <w:rPr>
+          <w:rFonts w:hint="default" w:ascii="Arial" w:hAnsi="Arial" w:cs="Arial"/>
+          <w:sz w:val="20"/>
+          <w:szCs w:val="20"/>
+          <w:lang w:val="en-US"/>
+        </w:rPr>
+        <w:t>}</w:t>
+      </w:r>
+      <w:r>
+        <w:rPr>
+          <w:rFonts w:ascii="Arial" w:hAnsi="Arial" w:cs="Arial"/>
+          <w:sz w:val="20"/>
+          <w:szCs w:val="20"/>
+        </w:rPr>
+        <w:fldChar w:fldCharType="end"/>
+      </w:r>
+      <w:r>
+        <w:rPr>
+          <w:rFonts w:ascii="Arial" w:hAnsi="Arial" w:cs="Arial"/>
+          <w:sz w:val="20"/>
+          <w:szCs w:val="20"/>
         </w:rPr>
         <w:tab/>
       </w:r>
       <w:r>
         <w:rPr>
           <w:rFonts w:ascii="Arial" w:hAnsi="Arial" w:cs="Arial"/>
-          <w:sz w:val="18"/>
-          <w:szCs w:val="18"/>
+          <w:sz w:val="20"/>
+          <w:szCs w:val="20"/>
         </w:rPr>
         <w:tab/>
       </w:r>
       <w:r>
         <w:rPr>
           <w:rFonts w:ascii="Arial" w:hAnsi="Arial" w:cs="Arial"/>
-          <w:sz w:val="18"/>
-          <w:szCs w:val="18"/>
+          <w:sz w:val="20"/>
+          <w:szCs w:val="20"/>
         </w:rPr>
         <w:tab/>
       </w:r>
       <w:r>
         <w:rPr>
           <w:rFonts w:ascii="Arial" w:hAnsi="Arial" w:cs="Arial"/>
-          <w:sz w:val="18"/>
-          <w:szCs w:val="18"/>
-        </w:rPr>
-        <w:tab/>
-      </w:r>
-      <w:r>
-        <w:rPr>
-          <w:rFonts w:hint="default" w:ascii="Arial" w:hAnsi="Arial" w:cs="Arial"/>
-          <w:sz w:val="18"/>
-          <w:szCs w:val="18"/>
-          <w:lang w:val="en-US"/>
-        </w:rPr>
-        <w:t xml:space="preserve"> </w:t>
-      </w:r>
-      <w:r>
-        <w:rPr>
-          <w:rFonts w:hint="default" w:ascii="Arial" w:hAnsi="Arial" w:cs="Arial"/>
-          <w:sz w:val="18"/>
-          <w:szCs w:val="18"/>
-          <w:lang w:val="en-US"/>
-        </w:rPr>
-        <w:tab/>
-      </w:r>
-      <w:r>
-        <w:rPr>
-          <w:rFonts w:hint="default" w:ascii="Arial" w:hAnsi="Arial" w:cs="Arial"/>
-          <w:sz w:val="18"/>
-          <w:szCs w:val="18"/>
-          <w:lang w:val="en-US"/>
-        </w:rPr>
-        <w:tab/>
-        <w:t/>
-      </w:r>
-      <w:r>
-        <w:rPr>
-          <w:rFonts w:hint="default" w:ascii="Arial" w:hAnsi="Arial" w:cs="Arial"/>
-          <w:sz w:val="18"/>
-          <w:szCs w:val="18"/>
-          <w:lang w:val="en-US"/>
-        </w:rPr>
-        <w:tab/>
-      </w:r>
-      <w:r>
-        <w:rPr>
-          <w:rFonts w:ascii="Arial" w:hAnsi="Arial" w:cs="Arial"/>
-          <w:sz w:val="18"/>
-          <w:szCs w:val="18"/>
-          <w:u w:val="single"/>
-        </w:rPr>
-        <w:tab/>
-      </w:r>
-      <w:r>
-        <w:rPr>
-          <w:rFonts w:hint="default" w:ascii="Arial" w:hAnsi="Arial" w:cs="Arial"/>
-          <w:sz w:val="18"/>
-          <w:szCs w:val="18"/>
-          <w:u w:val="single"/>
-          <w:lang w:val="en-US"/>
-        </w:rPr>
-        <w:t xml:space="preserve">  {CHIEF_FSES}</w:t>
-      </w:r>
-      <w:r>
-        <w:rPr>
-          <w:rFonts w:ascii="Arial" w:hAnsi="Arial" w:cs="Arial"/>
-          <w:sz w:val="18"/>
-          <w:szCs w:val="18"/>
-          <w:u w:val="single"/>
-        </w:rPr>
-        <w:tab/>
-      </w:r>
-      <w:r>
-        <w:rPr>
-          <w:rFonts w:ascii="Arial" w:hAnsi="Arial" w:cs="Arial"/>
-          <w:sz w:val="18"/>
-          <w:szCs w:val="18"/>
-          <w:u w:val="single"/>
-        </w:rPr>
-        <w:tab/>
+          <w:sz w:val="20"/>
+          <w:szCs w:val="20"/>
+        </w:rPr>
+        <w:t xml:space="preserve">   </w:t>
       </w:r>
     </w:p>
     <w:p>
       <w:pPr>
         <w:spacing w:after="0" w:line="240" w:lineRule="auto"/>
-        <w:ind w:left="540"/>
+        <w:ind w:firstLine="720" w:firstLineChars="0"/>
+        <w:rPr>
+          <w:rFonts w:ascii="Arial Narrow" w:hAnsi="Arial Narrow" w:cs="Arial"/>
+        </w:rPr>
+      </w:pPr>
+      <w:r>
+        <w:rPr>
+          <w:rFonts w:ascii="Arial" w:hAnsi="Arial" w:cs="Arial"/>
+          <w:sz w:val="24"/>
+          <w:szCs w:val="24"/>
+          <w:lang w:val="en-US" w:eastAsia="en-US"/>
+        </w:rPr>
+        <mc:AlternateContent>
+          <mc:Choice Requires="wps">
+            <w:drawing>
+              <wp:anchor distT="0" distB="0" distL="114300" distR="114300" simplePos="0" relativeHeight="251721728" behindDoc="0" locked="0" layoutInCell="1" allowOverlap="1">
+                <wp:simplePos x="0" y="0"/>
+                <wp:positionH relativeFrom="column">
+                  <wp:posOffset>765810</wp:posOffset>
+                </wp:positionH>
+                <wp:positionV relativeFrom="paragraph">
+                  <wp:posOffset>1270</wp:posOffset>
+                </wp:positionV>
+                <wp:extent cx="1314450" cy="0"/>
+                <wp:effectExtent l="0" t="4445" r="0" b="5080"/>
+                <wp:wrapNone/>
+                <wp:docPr id="299919102" name="Straight Connector 22"/>
+                <wp:cNvGraphicFramePr/>
+                <a:graphic xmlns:a="http://schemas.openxmlformats.org/drawingml/2006/main">
+                  <a:graphicData uri="http://schemas.microsoft.com/office/word/2010/wordprocessingShape">
+                    <wps:wsp>
+                      <wps:cNvCnPr/>
+                      <wps:spPr>
+                        <a:xfrm>
+                          <a:off x="0" y="0"/>
+                          <a:ext cx="1314450" cy="0"/>
+                        </a:xfrm>
+                        <a:prstGeom prst="line">
+                          <a:avLst/>
+                        </a:prstGeom>
+                      </wps:spPr>
+                      <wps:style>
+                        <a:lnRef idx="1">
+                          <a:schemeClr val="dk1"/>
+                        </a:lnRef>
+                        <a:fillRef idx="0">
+                          <a:schemeClr val="dk1"/>
+                        </a:fillRef>
+                        <a:effectRef idx="0">
+                          <a:schemeClr val="dk1"/>
+                        </a:effectRef>
+                        <a:fontRef idx="minor">
+                          <a:schemeClr val="tx1"/>
+                        </a:fontRef>
+                      </wps:style>
+                      <wps:bodyPr/>
+                    </wps:wsp>
+                  </a:graphicData>
+                </a:graphic>
+              </wp:anchor>
+            </w:drawing>
+          </mc:Choice>
+          <mc:Fallback>
+            <w:pict>
+              <v:line id="Straight Connector 22" o:spid="_x0000_s1026" o:spt="20" style="position:absolute;left:0pt;margin-left:60.3pt;margin-top:0.1pt;height:0pt;width:103.5pt;z-index:251721728;mso-width-relative:page;mso-height-relative:page;" filled="f" stroked="t" coordsize="21600,21600" o:gfxdata="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">
+                <v:fill on="f" focussize="0,0"/>
+                <v:stroke color="#000000 [3200]" joinstyle="round"/>
+                <v:imagedata o:title=""/>
+                <o:lock v:ext="edit" aspectratio="f"/>
+              </v:line>
+            </w:pict>
+          </mc:Fallback>
+        </mc:AlternateContent>
+      </w:r>
+      <w:r>
         <w:rPr>
           <w:rFonts w:ascii="Arial" w:hAnsi="Arial" w:cs="Arial"/>
           <w:sz w:val="20"/>
           <w:szCs w:val="20"/>
         </w:rPr>
-      </w:pPr>
-      <w:r>
-        <w:rPr>
-          <w:rFonts w:ascii="Arial Narrow" w:hAnsi="Arial Narrow" w:cs="Arial"/>
+        <w:tab/>
+      </w:r>
+      <w:r>
+        <w:rPr>
+          <w:rFonts w:ascii="Arial" w:hAnsi="Arial" w:cs="Arial"/>
           <w:sz w:val="20"/>
           <w:szCs w:val="20"/>
         </w:rPr>
@@ -7783,7 +8352,7 @@
       </w:r>
       <w:r>
         <w:rPr>
-          <w:rFonts w:ascii="Arial Narrow" w:hAnsi="Arial Narrow" w:cs="Arial"/>
+          <w:rFonts w:ascii="Arial" w:hAnsi="Arial" w:cs="Arial"/>
           <w:sz w:val="20"/>
           <w:szCs w:val="20"/>
         </w:rPr>
@@ -7791,7 +8360,7 @@
       </w:r>
       <w:r>
         <w:rPr>
-          <w:rFonts w:ascii="Arial Narrow" w:hAnsi="Arial Narrow" w:cs="Arial"/>
+          <w:rFonts w:ascii="Arial" w:hAnsi="Arial" w:cs="Arial"/>
           <w:sz w:val="20"/>
           <w:szCs w:val="20"/>
         </w:rPr>
@@ -7800,377 +8369,437 @@
       <w:r>
         <w:rPr>
           <w:rFonts w:ascii="Arial Narrow" w:hAnsi="Arial Narrow" w:cs="Arial"/>
-          <w:sz w:val="20"/>
-          <w:szCs w:val="20"/>
         </w:rPr>
         <w:tab/>
       </w:r>
       <w:r>
         <w:rPr>
           <w:rFonts w:ascii="Arial Narrow" w:hAnsi="Arial Narrow" w:cs="Arial"/>
-          <w:sz w:val="20"/>
-          <w:szCs w:val="20"/>
         </w:rPr>
         <w:tab/>
       </w:r>
       <w:r>
         <w:rPr>
           <w:rFonts w:ascii="Arial Narrow" w:hAnsi="Arial Narrow" w:cs="Arial"/>
-          <w:sz w:val="20"/>
-          <w:szCs w:val="20"/>
         </w:rPr>
         <w:tab/>
       </w:r>
       <w:r>
         <w:rPr>
+          <w:rFonts w:hint="default" w:ascii="Arial Narrow" w:hAnsi="Arial Narrow" w:cs="Arial"/>
+          <w:lang w:val="en-US"/>
+        </w:rPr>
+        <w:t xml:space="preserve">    </w:t>
+      </w:r>
+      <w:r>
+        <w:rPr>
           <w:rFonts w:ascii="Arial Narrow" w:hAnsi="Arial Narrow" w:cs="Arial"/>
-          <w:sz w:val="20"/>
-          <w:szCs w:val="20"/>
         </w:rPr>
         <w:tab/>
       </w:r>
       <w:r>
         <w:rPr>
           <w:rFonts w:ascii="Arial Narrow" w:hAnsi="Arial Narrow" w:cs="Arial"/>
-          <w:sz w:val="20"/>
-          <w:szCs w:val="20"/>
         </w:rPr>
         <w:tab/>
       </w:r>
       <w:r>
         <w:rPr>
           <w:rFonts w:ascii="Arial Narrow" w:hAnsi="Arial Narrow" w:cs="Arial"/>
-          <w:sz w:val="20"/>
-          <w:szCs w:val="20"/>
         </w:rPr>
         <w:tab/>
       </w:r>
       <w:r>
         <w:rPr>
           <w:rFonts w:ascii="Arial Narrow" w:hAnsi="Arial Narrow" w:cs="Arial"/>
-          <w:sz w:val="20"/>
-          <w:szCs w:val="20"/>
-        </w:rPr>
-        <w:t xml:space="preserve">                  </w:t>
-      </w:r>
-      <w:r>
-        <w:rPr>
-          <w:rFonts w:ascii="Arial" w:hAnsi="Arial" w:cs="Arial"/>
-          <w:sz w:val="20"/>
-          <w:szCs w:val="20"/>
-        </w:rPr>
-        <w:t>CHIEF, FSES</w:t>
+        </w:rPr>
+        <w:tab/>
+      </w:r>
+      <w:r>
+        <w:rPr>
+          <w:rFonts w:ascii="Arial Narrow" w:hAnsi="Arial Narrow" w:cs="Arial"/>
+        </w:rPr>
+        <w:tab/>
+      </w:r>
+      <w:r>
+        <w:rPr>
+          <w:rFonts w:ascii="Arial Narrow" w:hAnsi="Arial Narrow" w:cs="Arial"/>
+        </w:rPr>
+        <w:tab/>
+      </w:r>
+      <w:r>
+        <w:rPr>
+          <w:rFonts w:ascii="Arial Narrow" w:hAnsi="Arial Narrow" w:cs="Arial"/>
+        </w:rPr>
+        <w:tab/>
+      </w:r>
+      <w:r>
+        <w:rPr>
+          <w:rFonts w:ascii="Arial Narrow" w:hAnsi="Arial Narrow" w:cs="Arial"/>
+        </w:rPr>
+        <w:tab/>
+      </w:r>
+      <w:r>
+        <w:rPr>
+          <w:rFonts w:ascii="Arial Narrow" w:hAnsi="Arial Narrow" w:cs="Arial"/>
+        </w:rPr>
+        <w:tab/>
+      </w:r>
+      <w:r>
+        <w:rPr>
+          <w:rFonts w:ascii="Arial Narrow" w:hAnsi="Arial Narrow" w:cs="Arial"/>
+        </w:rPr>
+        <w:t xml:space="preserve">   </w:t>
+      </w:r>
+      <w:r>
+        <w:rPr>
+          <w:rFonts w:hint="default" w:ascii="Arial Narrow" w:hAnsi="Arial Narrow" w:cs="Arial"/>
+          <w:lang w:val="en-US"/>
+        </w:rPr>
+        <w:tab/>
+      </w:r>
+      <w:r>
+        <w:rPr>
+          <w:rFonts w:hint="default" w:ascii="Arial Narrow" w:hAnsi="Arial Narrow" w:cs="Arial"/>
+          <w:lang w:val="en-US"/>
+        </w:rPr>
+        <w:tab/>
+      </w:r>
+      <w:r>
+        <w:rPr>
+          <w:rFonts w:hint="default" w:ascii="Arial Narrow" w:hAnsi="Arial Narrow" w:cs="Arial"/>
+          <w:lang w:val="en-US"/>
+        </w:rPr>
+        <w:tab/>
       </w:r>
     </w:p>
     <w:p>
       <w:pPr>
         <w:spacing w:after="0" w:line="240" w:lineRule="auto"/>
-        <w:ind w:left="540"/>
+        <w:ind w:firstLine="720" w:firstLineChars="0"/>
         <w:rPr>
           <w:rFonts w:ascii="Arial Narrow" w:hAnsi="Arial Narrow" w:cs="Arial"/>
-          <w:sz w:val="10"/>
-          <w:szCs w:val="10"/>
-        </w:rPr>
-      </w:pPr>
-      <w:r>
-        <w:rPr>
-          <w:rFonts w:ascii="Arial Narrow" w:hAnsi="Arial Narrow" w:cs="Arial"/>
-          <w:sz w:val="20"/>
-          <w:szCs w:val="20"/>
-        </w:rPr>
-        <w:tab/>
-      </w:r>
-      <w:r>
-        <w:rPr>
-          <w:rFonts w:ascii="Arial Narrow" w:hAnsi="Arial Narrow" w:cs="Arial"/>
-          <w:sz w:val="20"/>
-          <w:szCs w:val="20"/>
-        </w:rPr>
-        <w:tab/>
-      </w:r>
-      <w:r>
-        <w:rPr>
-          <w:rFonts w:ascii="Arial Narrow" w:hAnsi="Arial Narrow" w:cs="Arial"/>
-          <w:sz w:val="20"/>
-          <w:szCs w:val="20"/>
-        </w:rPr>
-        <w:tab/>
-      </w:r>
-      <w:r>
-        <w:rPr>
-          <w:rFonts w:ascii="Arial Narrow" w:hAnsi="Arial Narrow" w:cs="Arial"/>
-          <w:sz w:val="20"/>
-          <w:szCs w:val="20"/>
-        </w:rPr>
-        <w:tab/>
-      </w:r>
-      <w:r>
-        <w:rPr>
-          <w:rFonts w:ascii="Arial Narrow" w:hAnsi="Arial Narrow" w:cs="Arial"/>
-          <w:sz w:val="20"/>
-          <w:szCs w:val="20"/>
-        </w:rPr>
-        <w:tab/>
-      </w:r>
-      <w:r>
-        <w:rPr>
-          <w:rFonts w:ascii="Arial Narrow" w:hAnsi="Arial Narrow" w:cs="Arial"/>
-          <w:sz w:val="20"/>
-          <w:szCs w:val="20"/>
-        </w:rPr>
-        <w:tab/>
-      </w:r>
-      <w:r>
-        <w:rPr>
-          <w:rFonts w:ascii="Arial Narrow" w:hAnsi="Arial Narrow" w:cs="Arial"/>
-          <w:sz w:val="20"/>
-          <w:szCs w:val="20"/>
-        </w:rPr>
-        <w:tab/>
-      </w:r>
-      <w:r>
-        <w:rPr>
-          <w:rFonts w:ascii="Arial Narrow" w:hAnsi="Arial Narrow" w:cs="Arial"/>
-          <w:sz w:val="20"/>
-          <w:szCs w:val="20"/>
-        </w:rPr>
-        <w:tab/>
-      </w:r>
-      <w:r>
-        <w:rPr>
-          <w:rFonts w:ascii="Arial Narrow" w:hAnsi="Arial Narrow" w:cs="Arial"/>
-          <w:sz w:val="20"/>
-          <w:szCs w:val="20"/>
-        </w:rPr>
-        <w:t xml:space="preserve">           </w:t>
-      </w:r>
-    </w:p>
-    <w:p>
-      <w:pPr>
-        <w:spacing w:after="0" w:line="240" w:lineRule="auto"/>
-        <w:ind w:left="6300"/>
-        <w:rPr>
-          <w:rFonts w:ascii="Arial" w:hAnsi="Arial" w:cs="Arial"/>
-          <w:b/>
-          <w:sz w:val="20"/>
-          <w:szCs w:val="20"/>
-        </w:rPr>
-      </w:pPr>
-      <w:r>
-        <w:rPr>
-          <w:rFonts w:ascii="Arial Narrow" w:hAnsi="Arial Narrow" w:cs="Arial"/>
-          <w:sz w:val="20"/>
-          <w:szCs w:val="20"/>
-        </w:rPr>
-        <w:t xml:space="preserve">     </w:t>
-      </w:r>
-      <w:r>
-        <w:rPr>
-          <w:rFonts w:ascii="Arial" w:hAnsi="Arial" w:cs="Arial"/>
-          <w:b/>
-          <w:sz w:val="20"/>
-          <w:szCs w:val="20"/>
-        </w:rPr>
-        <w:t>APPROVED:</w:t>
-      </w:r>
-      <w:r>
-        <w:rPr>
-          <w:rFonts w:ascii="Arial" w:hAnsi="Arial" w:cs="Arial"/>
-          <w:sz w:val="20"/>
-          <w:szCs w:val="20"/>
-        </w:rPr>
-        <w:t xml:space="preserve"> </w:t>
-      </w:r>
-    </w:p>
-    <w:p>
-      <w:pPr>
-        <w:spacing w:after="0" w:line="240" w:lineRule="auto"/>
-        <w:ind w:left="540"/>
-        <w:rPr>
-          <w:rFonts w:ascii="Arial Narrow" w:hAnsi="Arial Narrow" w:cs="Arial"/>
-          <w:sz w:val="10"/>
-          <w:szCs w:val="10"/>
         </w:rPr>
       </w:pPr>
     </w:p>
     <w:p>
       <w:pPr>
         <w:spacing w:after="0" w:line="240" w:lineRule="auto"/>
-        <w:ind w:left="540"/>
+        <w:ind w:firstLine="720" w:firstLineChars="0"/>
+        <w:rPr>
+          <w:rFonts w:ascii="Arial" w:hAnsi="Arial" w:cs="Arial"/>
+          <w:b/>
+        </w:rPr>
+      </w:pPr>
+      <w:r>
         <w:rPr>
           <w:rFonts w:ascii="Arial Narrow" w:hAnsi="Arial Narrow" w:cs="Arial"/>
-          <w:sz w:val="10"/>
-          <w:szCs w:val="10"/>
+        </w:rPr>
+        <w:tab/>
+      </w:r>
+      <w:r>
+        <w:rPr>
+          <w:rFonts w:ascii="Arial Narrow" w:hAnsi="Arial Narrow" w:cs="Arial"/>
+        </w:rPr>
+        <w:tab/>
+      </w:r>
+      <w:r>
+        <w:rPr>
+          <w:rFonts w:ascii="Arial Narrow" w:hAnsi="Arial Narrow" w:cs="Arial"/>
+        </w:rPr>
+        <w:tab/>
+      </w:r>
+      <w:r>
+        <w:rPr>
+          <w:rFonts w:ascii="Arial Narrow" w:hAnsi="Arial Narrow" w:cs="Arial"/>
+        </w:rPr>
+        <w:tab/>
+      </w:r>
+      <w:r>
+        <w:rPr>
+          <w:rFonts w:ascii="Arial Narrow" w:hAnsi="Arial Narrow" w:cs="Arial"/>
+        </w:rPr>
+        <w:tab/>
+      </w:r>
+      <w:r>
+        <w:rPr>
+          <w:rFonts w:ascii="Arial Narrow" w:hAnsi="Arial Narrow" w:cs="Arial"/>
+        </w:rPr>
+        <w:tab/>
+      </w:r>
+      <w:r>
+        <w:rPr>
+          <w:rFonts w:ascii="Arial Narrow" w:hAnsi="Arial Narrow" w:cs="Arial"/>
+        </w:rPr>
+        <w:tab/>
+      </w:r>
+      <w:r>
+        <w:rPr>
+          <w:rFonts w:ascii="Arial Narrow" w:hAnsi="Arial Narrow" w:cs="Arial"/>
+        </w:rPr>
+        <w:tab/>
+      </w:r>
+      <w:r>
+        <w:rPr>
+          <w:rFonts w:ascii="Arial" w:hAnsi="Arial" w:cs="Arial"/>
+          <w:b/>
+        </w:rPr>
+        <w:t>APPROVED:</w:t>
+      </w:r>
+      <w:r>
+        <w:rPr>
+          <w:rFonts w:ascii="Arial" w:hAnsi="Arial" w:cs="Arial"/>
+        </w:rPr>
+        <w:t xml:space="preserve"> </w:t>
+      </w:r>
+    </w:p>
+    <w:p>
+      <w:pPr>
+        <w:spacing w:after="0" w:line="240" w:lineRule="auto"/>
+        <w:ind w:firstLine="720" w:firstLineChars="0"/>
+        <w:rPr>
+          <w:rFonts w:ascii="Arial Narrow" w:hAnsi="Arial Narrow" w:cs="Arial"/>
+        </w:rPr>
+      </w:pPr>
+      <w:r>
+        <w:rPr>
+          <w:rFonts w:ascii="Arial" w:hAnsi="Arial" w:cs="Arial"/>
+          <w:sz w:val="24"/>
+          <w:szCs w:val="24"/>
+          <w:lang w:val="en-US" w:eastAsia="en-US"/>
+        </w:rPr>
+        <mc:AlternateContent>
+          <mc:Choice Requires="wps">
+            <w:drawing>
+              <wp:anchor distT="0" distB="0" distL="114300" distR="114300" simplePos="0" relativeHeight="251717632" behindDoc="0" locked="0" layoutInCell="1" allowOverlap="1">
+                <wp:simplePos x="0" y="0"/>
+                <wp:positionH relativeFrom="column">
+                  <wp:posOffset>3467735</wp:posOffset>
+                </wp:positionH>
+                <wp:positionV relativeFrom="paragraph">
+                  <wp:posOffset>78105</wp:posOffset>
+                </wp:positionV>
+                <wp:extent cx="2513965" cy="342900"/>
+                <wp:effectExtent l="0" t="0" r="0" b="0"/>
+                <wp:wrapNone/>
+                <wp:docPr id="63" name="Text Box 63"/>
+                <wp:cNvGraphicFramePr/>
+                <a:graphic xmlns:a="http://schemas.openxmlformats.org/drawingml/2006/main">
+                  <a:graphicData uri="http://schemas.microsoft.com/office/word/2010/wordprocessingShape">
+                    <wps:wsp>
+                      <wps:cNvSpPr txBox="1"/>
+                      <wps:spPr>
+                        <a:xfrm>
+                          <a:off x="0" y="0"/>
+                          <a:ext cx="2513965" cy="342900"/>
+                        </a:xfrm>
+                        <a:prstGeom prst="rect">
+                          <a:avLst/>
+                        </a:prstGeom>
+                        <a:noFill/>
+                        <a:ln w="6350">
+                          <a:noFill/>
+                        </a:ln>
+                        <a:effectLst/>
+                      </wps:spPr>
+                      <wps:style>
+                        <a:lnRef idx="0">
+                          <a:schemeClr val="accent1"/>
+                        </a:lnRef>
+                        <a:fillRef idx="0">
+                          <a:schemeClr val="accent1"/>
+                        </a:fillRef>
+                        <a:effectRef idx="0">
+                          <a:schemeClr val="accent1"/>
+                        </a:effectRef>
+                        <a:fontRef idx="minor">
+                          <a:schemeClr val="dk1"/>
+                        </a:fontRef>
+                      </wps:style>
+                      <wps:txbx>
+                        <w:txbxContent>
+                          <w:p>
+                            <w:pPr>
+                              <w:spacing w:after="0" w:line="240" w:lineRule="auto"/>
+                              <w:jc w:val="center"/>
+                              <w:rPr>
+                                <w:rFonts w:hint="default" w:ascii="Arial" w:hAnsi="Arial" w:eastAsia="Times New Roman" w:cs="Arial"/>
+                                <w:color w:val="000000"/>
+                                <w:sz w:val="22"/>
+                                <w:szCs w:val="22"/>
+                                <w:lang w:val="en-US"/>
+                              </w:rPr>
+                            </w:pPr>
+                            <w:r>
+                              <w:rPr>
+                                <w:rFonts w:hint="default" w:ascii="Arial" w:hAnsi="Arial" w:eastAsia="Times New Roman" w:cs="Arial"/>
+                                <w:color w:val="000000"/>
+                                <w:sz w:val="22"/>
+                                <w:szCs w:val="22"/>
+                                <w:lang w:val="en-US"/>
+                              </w:rPr>
+                              <w:t>{FIRE_MARSHAL}</w:t>
+                            </w:r>
+                          </w:p>
+                        </w:txbxContent>
+                      </wps:txbx>
+                      <wps:bodyPr rot="0" spcFirstLastPara="0" vertOverflow="overflow" horzOverflow="overflow" vert="horz" wrap="square" lIns="91440" tIns="45720" rIns="91440" bIns="45720" numCol="1" spcCol="0" rtlCol="0" fromWordArt="0" anchor="t" anchorCtr="0" forceAA="0" compatLnSpc="1">
+                        <a:noAutofit/>
+                      </wps:bodyPr>
+                    </wps:wsp>
+                  </a:graphicData>
+                </a:graphic>
+              </wp:anchor>
+            </w:drawing>
+          </mc:Choice>
+          <mc:Fallback>
+            <w:pict>
+              <v:shape id="_x0000_s1026" o:spid="_x0000_s1026" o:spt="202" type="#_x0000_t202" style="position:absolute;left:0pt;margin-left:273.05pt;margin-top:6.15pt;height:27pt;width:197.95pt;z-index:251717632;mso-width-relative:page;mso-height-relative:page;" filled="f" stroked="f" coordsize="21600,21600" o:gfxdata="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">
+                <v:fill on="f" focussize="0,0"/>
+                <v:stroke on="f" weight="0.5pt"/>
+                <v:imagedata o:title=""/>
+                <o:lock v:ext="edit" aspectratio="f"/>
+                <v:textbox>
+                  <w:txbxContent>
+                    <w:p>
+                      <w:pPr>
+                        <w:spacing w:after="0" w:line="240" w:lineRule="auto"/>
+                        <w:jc w:val="center"/>
+                        <w:rPr>
+                          <w:rFonts w:hint="default" w:ascii="Arial" w:hAnsi="Arial" w:eastAsia="Times New Roman" w:cs="Arial"/>
+                          <w:color w:val="000000"/>
+                          <w:sz w:val="22"/>
+                          <w:szCs w:val="22"/>
+                          <w:lang w:val="en-US"/>
+                        </w:rPr>
+                      </w:pPr>
+                      <w:r>
+                        <w:rPr>
+                          <w:rFonts w:hint="default" w:ascii="Arial" w:hAnsi="Arial" w:eastAsia="Times New Roman" w:cs="Arial"/>
+                          <w:color w:val="000000"/>
+                          <w:sz w:val="22"/>
+                          <w:szCs w:val="22"/>
+                          <w:lang w:val="en-US"/>
+                        </w:rPr>
+                        <w:t>{FIRE_MARSHAL}</w:t>
+                      </w:r>
+                    </w:p>
+                  </w:txbxContent>
+                </v:textbox>
+              </v:shape>
+            </w:pict>
+          </mc:Fallback>
+        </mc:AlternateContent>
+      </w:r>
+    </w:p>
+    <w:p>
+      <w:pPr>
+        <w:spacing w:after="0" w:line="240" w:lineRule="auto"/>
+        <w:ind w:firstLine="720" w:firstLineChars="0"/>
+        <w:rPr>
+          <w:rFonts w:ascii="Arial Narrow" w:hAnsi="Arial Narrow" w:cs="Arial"/>
         </w:rPr>
       </w:pPr>
     </w:p>
     <w:p>
       <w:pPr>
         <w:spacing w:after="0" w:line="240" w:lineRule="auto"/>
-        <w:ind w:left="540"/>
+        <w:ind w:firstLine="720" w:firstLineChars="0"/>
+        <w:rPr>
+          <w:rFonts w:ascii="Arial" w:hAnsi="Arial" w:cs="Arial"/>
+          <w:sz w:val="20"/>
+          <w:szCs w:val="20"/>
+        </w:rPr>
+      </w:pPr>
+      <w:r>
+        <w:rPr>
+          <w:rFonts w:ascii="Arial" w:hAnsi="Arial" w:cs="Arial"/>
+          <w:lang w:val="en-US" w:eastAsia="en-US"/>
+        </w:rPr>
+        <mc:AlternateContent>
+          <mc:Choice Requires="wps">
+            <w:drawing>
+              <wp:anchor distT="0" distB="0" distL="114300" distR="114300" simplePos="0" relativeHeight="251716608" behindDoc="0" locked="0" layoutInCell="1" allowOverlap="1">
+                <wp:simplePos x="0" y="0"/>
+                <wp:positionH relativeFrom="column">
+                  <wp:posOffset>3488690</wp:posOffset>
+                </wp:positionH>
+                <wp:positionV relativeFrom="paragraph">
+                  <wp:posOffset>1905</wp:posOffset>
+                </wp:positionV>
+                <wp:extent cx="2461260" cy="635"/>
+                <wp:effectExtent l="0" t="0" r="0" b="0"/>
+                <wp:wrapNone/>
+                <wp:docPr id="64" name="Straight Connector 64"/>
+                <wp:cNvGraphicFramePr/>
+                <a:graphic xmlns:a="http://schemas.openxmlformats.org/drawingml/2006/main">
+                  <a:graphicData uri="http://schemas.microsoft.com/office/word/2010/wordprocessingShape">
+                    <wps:wsp>
+                      <wps:cNvCnPr/>
+                      <wps:spPr>
+                        <a:xfrm>
+                          <a:off x="0" y="0"/>
+                          <a:ext cx="2461260" cy="635"/>
+                        </a:xfrm>
+                        <a:prstGeom prst="line">
+                          <a:avLst/>
+                        </a:prstGeom>
+                      </wps:spPr>
+                      <wps:style>
+                        <a:lnRef idx="1">
+                          <a:schemeClr val="dk1"/>
+                        </a:lnRef>
+                        <a:fillRef idx="0">
+                          <a:schemeClr val="dk1"/>
+                        </a:fillRef>
+                        <a:effectRef idx="0">
+                          <a:schemeClr val="dk1"/>
+                        </a:effectRef>
+                        <a:fontRef idx="minor">
+                          <a:schemeClr val="tx1"/>
+                        </a:fontRef>
+                      </wps:style>
+                      <wps:bodyPr/>
+                    </wps:wsp>
+                  </a:graphicData>
+                </a:graphic>
+              </wp:anchor>
+            </w:drawing>
+          </mc:Choice>
+          <mc:Fallback>
+            <w:pict>
+              <v:line id="_x0000_s1026" o:spid="_x0000_s1026" o:spt="20" style="position:absolute;left:0pt;margin-left:274.7pt;margin-top:0.15pt;height:0.05pt;width:193.8pt;z-index:251716608;mso-width-relative:page;mso-height-relative:page;" filled="f" stroked="t" coordsize="21600,21600" o:gfxdata="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">
+                <v:fill on="f" focussize="0,0"/>
+                <v:stroke color="#000000 [3200]" joinstyle="round"/>
+                <v:imagedata o:title=""/>
+                <o:lock v:ext="edit" aspectratio="f"/>
+              </v:line>
+            </w:pict>
+          </mc:Fallback>
+        </mc:AlternateContent>
+      </w:r>
+      <w:r>
         <w:rPr>
           <w:rFonts w:ascii="Arial Narrow" w:hAnsi="Arial Narrow" w:cs="Arial"/>
-          <w:sz w:val="10"/>
-          <w:szCs w:val="10"/>
-        </w:rPr>
-      </w:pPr>
+        </w:rPr>
+        <w:t xml:space="preserve">                                                                                                                    </w:t>
+      </w:r>
+      <w:r>
+        <w:rPr>
+          <w:rFonts w:ascii="Arial" w:hAnsi="Arial" w:cs="Arial"/>
+          <w:sz w:val="20"/>
+          <w:szCs w:val="20"/>
+        </w:rPr>
+        <w:t>CITY/MUNICIPAL FIRE MARSHAL</w:t>
+      </w:r>
     </w:p>
     <w:p>
       <w:pPr>
-        <w:spacing w:after="0" w:line="240" w:lineRule="auto"/>
-        <w:ind w:left="540"/>
+        <w:spacing w:after="0"/>
         <w:rPr>
           <w:rFonts w:ascii="Arial Narrow" w:hAnsi="Arial Narrow" w:cs="Arial"/>
-          <w:sz w:val="20"/>
-          <w:szCs w:val="20"/>
-          <w:u w:val="single"/>
         </w:rPr>
       </w:pPr>
-      <w:r>
-        <w:rPr>
-          <w:rFonts w:ascii="Arial Narrow" w:hAnsi="Arial Narrow" w:cs="Arial"/>
-          <w:sz w:val="20"/>
-          <w:szCs w:val="20"/>
-        </w:rPr>
-        <w:tab/>
-      </w:r>
-      <w:r>
-        <w:rPr>
-          <w:rFonts w:ascii="Arial Narrow" w:hAnsi="Arial Narrow" w:cs="Arial"/>
-          <w:sz w:val="20"/>
-          <w:szCs w:val="20"/>
-        </w:rPr>
-        <w:tab/>
-      </w:r>
-      <w:r>
-        <w:rPr>
-          <w:rFonts w:ascii="Arial Narrow" w:hAnsi="Arial Narrow" w:cs="Arial"/>
-          <w:sz w:val="20"/>
-          <w:szCs w:val="20"/>
-        </w:rPr>
-        <w:tab/>
-      </w:r>
-      <w:r>
-        <w:rPr>
-          <w:rFonts w:ascii="Arial Narrow" w:hAnsi="Arial Narrow" w:cs="Arial"/>
-          <w:sz w:val="20"/>
-          <w:szCs w:val="20"/>
-        </w:rPr>
-        <w:tab/>
-      </w:r>
-      <w:r>
-        <w:rPr>
-          <w:rFonts w:ascii="Arial Narrow" w:hAnsi="Arial Narrow" w:cs="Arial"/>
-          <w:sz w:val="20"/>
-          <w:szCs w:val="20"/>
-        </w:rPr>
-        <w:tab/>
-      </w:r>
-      <w:r>
-        <w:rPr>
-          <w:rFonts w:ascii="Arial Narrow" w:hAnsi="Arial Narrow" w:cs="Arial"/>
-          <w:sz w:val="20"/>
-          <w:szCs w:val="20"/>
-        </w:rPr>
-        <w:tab/>
-      </w:r>
-      <w:r>
-        <w:rPr>
-          <w:rFonts w:ascii="Arial Narrow" w:hAnsi="Arial Narrow" w:cs="Arial"/>
-          <w:sz w:val="20"/>
-          <w:szCs w:val="20"/>
-        </w:rPr>
-        <w:tab/>
-      </w:r>
-      <w:r>
-        <w:rPr>
-          <w:rFonts w:ascii="Arial Narrow" w:hAnsi="Arial Narrow" w:cs="Arial"/>
-          <w:sz w:val="20"/>
-          <w:szCs w:val="20"/>
-        </w:rPr>
-        <w:tab/>
-      </w:r>
-      <w:r>
-        <w:rPr>
-          <w:rFonts w:ascii="Arial Narrow" w:hAnsi="Arial Narrow" w:cs="Arial"/>
-          <w:sz w:val="20"/>
-          <w:szCs w:val="20"/>
-        </w:rPr>
-        <w:t xml:space="preserve">                </w:t>
-      </w:r>
-      <w:r>
-        <w:rPr>
-          <w:rFonts w:ascii="Arial Narrow" w:hAnsi="Arial Narrow" w:cs="Arial"/>
-          <w:sz w:val="20"/>
-          <w:szCs w:val="20"/>
-          <w:u w:val="single"/>
-        </w:rPr>
-        <w:tab/>
-      </w:r>
-      <w:r>
-        <w:rPr>
-          <w:rFonts w:hint="default" w:ascii="Arial Narrow" w:hAnsi="Arial Narrow" w:cs="Arial"/>
-          <w:sz w:val="20"/>
-          <w:szCs w:val="20"/>
-          <w:u w:val="single"/>
-          <w:lang w:val="en-US"/>
-        </w:rPr>
-        <w:t xml:space="preserve">    {FIRE_MARSHAL}</w:t>
-      </w:r>
-      <w:r>
-        <w:rPr>
-          <w:rFonts w:ascii="Arial Narrow" w:hAnsi="Arial Narrow" w:cs="Arial"/>
-          <w:sz w:val="20"/>
-          <w:szCs w:val="20"/>
-          <w:u w:val="single"/>
-        </w:rPr>
-        <w:tab/>
-      </w:r>
-      <w:r>
-        <w:rPr>
-          <w:rFonts w:ascii="Arial Narrow" w:hAnsi="Arial Narrow" w:cs="Arial"/>
-          <w:sz w:val="20"/>
-          <w:szCs w:val="20"/>
-          <w:u w:val="single"/>
-        </w:rPr>
-        <w:tab/>
-      </w:r>
-    </w:p>
-    <w:p>
-      <w:pPr>
-        <w:spacing w:after="0" w:line="240" w:lineRule="auto"/>
-        <w:ind w:left="540"/>
-        <w:rPr>
-          <w:rFonts w:ascii="Arial" w:hAnsi="Arial" w:cs="Arial"/>
-          <w:sz w:val="20"/>
-          <w:szCs w:val="20"/>
-        </w:rPr>
-      </w:pPr>
-      <w:r>
-        <w:rPr>
-          <w:rFonts w:ascii="Arial Narrow" w:hAnsi="Arial Narrow" w:cs="Arial"/>
-          <w:sz w:val="20"/>
-          <w:szCs w:val="20"/>
-        </w:rPr>
-        <w:t xml:space="preserve">                                                                                                                                 </w:t>
-      </w:r>
-      <w:r>
-        <w:rPr>
-          <w:rFonts w:hint="default" w:ascii="Arial Narrow" w:hAnsi="Arial Narrow" w:cs="Arial"/>
-          <w:sz w:val="20"/>
-          <w:szCs w:val="20"/>
-          <w:lang w:val="en-US"/>
-        </w:rPr>
-        <w:t xml:space="preserve">       </w:t>
-      </w:r>
-      <w:r>
-        <w:rPr>
-          <w:rFonts w:ascii="Arial" w:hAnsi="Arial" w:cs="Arial"/>
-          <w:sz w:val="20"/>
-          <w:szCs w:val="20"/>
-        </w:rPr>
-        <w:t>CITY/MUNICIPAL FIRE MARSHAL</w:t>
-      </w:r>
     </w:p>
     <w:p>
       <w:pPr>

</xml_diff>

<commit_message>
clerance template 3rd update
</commit_message>
<xml_diff>
--- a/backend/templates/FSED-34F-Hot-Works.docx
+++ b/backend/templates/FSED-34F-Hot-Works.docx
@@ -358,12 +358,12 @@
               <wp:anchor distT="0" distB="0" distL="114300" distR="114300" simplePos="0" relativeHeight="251712512" behindDoc="0" locked="0" layoutInCell="1" allowOverlap="1">
                 <wp:simplePos x="0" y="0"/>
                 <wp:positionH relativeFrom="column">
-                  <wp:posOffset>264160</wp:posOffset>
+                  <wp:posOffset>1299210</wp:posOffset>
                 </wp:positionH>
                 <wp:positionV relativeFrom="paragraph">
                   <wp:posOffset>78740</wp:posOffset>
                 </wp:positionV>
-                <wp:extent cx="3861435" cy="342900"/>
+                <wp:extent cx="2673985" cy="342900"/>
                 <wp:effectExtent l="0" t="0" r="0" b="0"/>
                 <wp:wrapNone/>
                 <wp:docPr id="49" name="Text Box 49"/>
@@ -375,7 +375,7 @@
                       <wps:spPr>
                         <a:xfrm>
                           <a:off x="0" y="0"/>
-                          <a:ext cx="3861435" cy="342900"/>
+                          <a:ext cx="2673985" cy="342900"/>
                         </a:xfrm>
                         <a:prstGeom prst="rect">
                           <a:avLst/>
@@ -418,15 +418,6 @@
                             </w:pPr>
                             <w:r>
                               <w:rPr>
-                                <w:rFonts w:ascii="Arial Narrow" w:hAnsi="Arial Narrow" w:cs="Arial"/>
-                                <w:b/>
-                                <w:sz w:val="28"/>
-                                <w:szCs w:val="28"/>
-                              </w:rPr>
-                              <w:t>FSCHWO NO.</w:t>
-                            </w:r>
-                            <w:r>
-                              <w:rPr>
                                 <w:rFonts w:hint="default" w:ascii="Arial Narrow" w:hAnsi="Arial Narrow" w:cs="Arial"/>
                                 <w:b/>
                                 <w:sz w:val="28"/>
@@ -461,7 +452,7 @@
           </mc:Choice>
           <mc:Fallback>
             <w:pict>
-              <v:shape id="_x0000_s1026" o:spid="_x0000_s1026" o:spt="202" type="#_x0000_t202" style="position:absolute;left:0pt;margin-left:20.8pt;margin-top:6.2pt;height:27pt;width:304.05pt;z-index:251712512;mso-width-relative:page;mso-height-relative:page;" filled="f" stroked="f" coordsize="21600,21600" o:gfxdata="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">
+              <v:shape id="_x0000_s1026" o:spid="_x0000_s1026" o:spt="202" type="#_x0000_t202" style="position:absolute;left:0pt;margin-left:102.3pt;margin-top:6.2pt;height:27pt;width:210.55pt;z-index:251712512;mso-width-relative:page;mso-height-relative:page;" filled="f" stroked="f" coordsize="21600,21600" o:gfxdata="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">
                 <v:fill on="f" focussize="0,0"/>
                 <v:stroke on="f" weight="0.5pt"/>
                 <v:imagedata o:title=""/>
@@ -482,15 +473,6 @@
                           <w:lang w:val="en-US"/>
                         </w:rPr>
                       </w:pPr>
-                      <w:r>
-                        <w:rPr>
-                          <w:rFonts w:ascii="Arial Narrow" w:hAnsi="Arial Narrow" w:cs="Arial"/>
-                          <w:b/>
-                          <w:sz w:val="28"/>
-                          <w:szCs w:val="28"/>
-                        </w:rPr>
-                        <w:t>FSCHWO NO.</w:t>
-                      </w:r>
                       <w:r>
                         <w:rPr>
                           <w:rFonts w:hint="default" w:ascii="Arial Narrow" w:hAnsi="Arial Narrow" w:cs="Arial"/>
@@ -801,16 +783,18 @@
           <w:sz w:val="28"/>
           <w:szCs w:val="28"/>
         </w:rPr>
-        <w:t xml:space="preserve">     </w:t>
-      </w:r>
-      <w:r>
-        <w:rPr>
-          <w:rFonts w:ascii="Arial" w:hAnsi="Arial" w:cs="Arial"/>
-          <w:color w:val="FF0000"/>
+        <w:t xml:space="preserve">    </w:t>
+      </w:r>
+      <w:bookmarkStart w:id="0" w:name="_GoBack"/>
+      <w:bookmarkEnd w:id="0"/>
+      <w:r>
+        <w:rPr>
+          <w:rFonts w:ascii="Arial Narrow" w:hAnsi="Arial Narrow" w:cs="Arial"/>
+          <w:b/>
           <w:sz w:val="28"/>
           <w:szCs w:val="28"/>
         </w:rPr>
-        <w:tab/>
+        <w:t>FSCHWO NO.</w:t>
       </w:r>
       <w:r>
         <w:rPr>
@@ -853,15 +837,7 @@
         <w:rPr>
           <w:rFonts w:ascii="Arial Narrow" w:hAnsi="Arial Narrow" w:cs="Arial"/>
         </w:rPr>
-        <w:t xml:space="preserve">     </w:t>
-      </w:r>
-      <w:bookmarkStart w:id="0" w:name="_GoBack"/>
-      <w:bookmarkEnd w:id="0"/>
-      <w:r>
-        <w:rPr>
-          <w:rFonts w:ascii="Arial Narrow" w:hAnsi="Arial Narrow" w:cs="Arial"/>
-        </w:rPr>
-        <w:t xml:space="preserve">                      </w:t>
+        <w:t xml:space="preserve">                           </w:t>
       </w:r>
     </w:p>
     <w:p>
@@ -9701,6 +9677,7 @@
     <w:basedOn w:val="2"/>
     <w:link w:val="4"/>
     <w:semiHidden/>
+    <w:qFormat/>
     <w:uiPriority w:val="99"/>
     <w:rPr>
       <w:rFonts w:ascii="Tahoma" w:hAnsi="Tahoma" w:cs="Tahoma"/>

</xml_diff>

<commit_message>
major update and fixes on clearance
</commit_message>
<xml_diff>
--- a/backend/templates/FSED-34F-Hot-Works.docx
+++ b/backend/templates/FSED-34F-Hot-Works.docx
@@ -335,6 +335,8 @@
         </w:rPr>
         <w:t>(Telephone No./Email Address)</w:t>
       </w:r>
+      <w:bookmarkStart w:id="0" w:name="_GoBack"/>
+      <w:bookmarkEnd w:id="0"/>
     </w:p>
     <w:p>
       <w:pPr>
@@ -358,12 +360,12 @@
               <wp:anchor distT="0" distB="0" distL="114300" distR="114300" simplePos="0" relativeHeight="251712512" behindDoc="0" locked="0" layoutInCell="1" allowOverlap="1">
                 <wp:simplePos x="0" y="0"/>
                 <wp:positionH relativeFrom="column">
-                  <wp:posOffset>1299210</wp:posOffset>
+                  <wp:posOffset>2036445</wp:posOffset>
                 </wp:positionH>
                 <wp:positionV relativeFrom="paragraph">
                   <wp:posOffset>78740</wp:posOffset>
                 </wp:positionV>
-                <wp:extent cx="2673985" cy="342900"/>
+                <wp:extent cx="1976755" cy="342900"/>
                 <wp:effectExtent l="0" t="0" r="0" b="0"/>
                 <wp:wrapNone/>
                 <wp:docPr id="49" name="Text Box 49"/>
@@ -375,7 +377,7 @@
                       <wps:spPr>
                         <a:xfrm>
                           <a:off x="0" y="0"/>
-                          <a:ext cx="2673985" cy="342900"/>
+                          <a:ext cx="1976755" cy="342900"/>
                         </a:xfrm>
                         <a:prstGeom prst="rect">
                           <a:avLst/>
@@ -436,7 +438,7 @@
                                 <w:szCs w:val="28"/>
                                 <w:lang w:val="en-US"/>
                               </w:rPr>
-                              <w:t>R10-STN5-{CONTROL_NUMBER}</w:t>
+                              <w:t>{CONTROL_NUMBER}</w:t>
                             </w:r>
                           </w:p>
                         </w:txbxContent>
@@ -452,7 +454,7 @@
           </mc:Choice>
           <mc:Fallback>
             <w:pict>
-              <v:shape id="_x0000_s1026" o:spid="_x0000_s1026" o:spt="202" type="#_x0000_t202" style="position:absolute;left:0pt;margin-left:102.3pt;margin-top:6.2pt;height:27pt;width:210.55pt;z-index:251712512;mso-width-relative:page;mso-height-relative:page;" filled="f" stroked="f" coordsize="21600,21600" o:gfxdata="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">
+              <v:shape id="_x0000_s1026" o:spid="_x0000_s1026" o:spt="202" type="#_x0000_t202" style="position:absolute;left:0pt;margin-left:160.35pt;margin-top:6.2pt;height:27pt;width:155.65pt;z-index:251712512;mso-width-relative:page;mso-height-relative:page;" filled="f" stroked="f" coordsize="21600,21600" o:gfxdata="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">
                 <v:fill on="f" focussize="0,0"/>
                 <v:stroke on="f" weight="0.5pt"/>
                 <v:imagedata o:title=""/>
@@ -493,7 +495,7 @@
                           <w:szCs w:val="28"/>
                           <w:lang w:val="en-US"/>
                         </w:rPr>
-                        <w:t>R10-STN5-{CONTROL_NUMBER}</w:t>
+                        <w:t>{CONTROL_NUMBER}</w:t>
                       </w:r>
                     </w:p>
                   </w:txbxContent>
@@ -783,27 +785,29 @@
           <w:sz w:val="28"/>
           <w:szCs w:val="28"/>
         </w:rPr>
-        <w:t xml:space="preserve">    </w:t>
-      </w:r>
-      <w:bookmarkStart w:id="0" w:name="_GoBack"/>
-      <w:bookmarkEnd w:id="0"/>
-      <w:r>
-        <w:rPr>
-          <w:rFonts w:ascii="Arial Narrow" w:hAnsi="Arial Narrow" w:cs="Arial"/>
+        <w:t xml:space="preserve">    FSCHWO NO.</w:t>
+      </w:r>
+      <w:r>
+        <w:rPr>
+          <w:rFonts w:hint="default" w:ascii="Arial Narrow" w:hAnsi="Arial Narrow" w:cs="Arial"/>
           <w:b/>
           <w:sz w:val="28"/>
           <w:szCs w:val="28"/>
-        </w:rPr>
-        <w:t>FSCHWO NO.</w:t>
-      </w:r>
-      <w:r>
-        <w:rPr>
-          <w:rFonts w:ascii="Arial" w:hAnsi="Arial" w:cs="Arial"/>
-          <w:color w:val="FF0000"/>
+          <w:lang w:val="en-US"/>
+        </w:rPr>
+        <w:t xml:space="preserve">  </w:t>
+      </w:r>
+      <w:r>
+        <w:rPr>
+          <w:rFonts w:hint="default" w:ascii="Arial Narrow" w:hAnsi="Arial Narrow" w:eastAsia="Times New Roman" w:cs="Arial Narrow"/>
+          <w:b/>
+          <w:bCs/>
+          <w:color w:val="000000"/>
           <w:sz w:val="28"/>
           <w:szCs w:val="28"/>
-        </w:rPr>
-        <w:tab/>
+          <w:lang w:val="en-US"/>
+        </w:rPr>
+        <w:t>R10-STN5-</w:t>
       </w:r>
       <w:r>
         <w:rPr>
@@ -7365,6 +7369,136 @@
           <w:szCs w:val="10"/>
         </w:rPr>
       </w:pPr>
+      <w:r>
+        <w:rPr>
+          <w:rFonts w:ascii="Arial" w:hAnsi="Arial" w:cs="Arial"/>
+          <w:sz w:val="24"/>
+          <w:szCs w:val="24"/>
+          <w:lang w:val="en-US" w:eastAsia="en-US"/>
+        </w:rPr>
+        <mc:AlternateContent>
+          <mc:Choice Requires="wps">
+            <w:drawing>
+              <wp:anchor distT="0" distB="0" distL="114300" distR="114300" simplePos="0" relativeHeight="251723776" behindDoc="0" locked="0" layoutInCell="1" allowOverlap="1">
+                <wp:simplePos x="0" y="0"/>
+                <wp:positionH relativeFrom="column">
+                  <wp:posOffset>2185035</wp:posOffset>
+                </wp:positionH>
+                <wp:positionV relativeFrom="paragraph">
+                  <wp:posOffset>10160</wp:posOffset>
+                </wp:positionV>
+                <wp:extent cx="2513965" cy="342900"/>
+                <wp:effectExtent l="0" t="0" r="0" b="0"/>
+                <wp:wrapNone/>
+                <wp:docPr id="55" name="Text Box 55"/>
+                <wp:cNvGraphicFramePr/>
+                <a:graphic xmlns:a="http://schemas.openxmlformats.org/drawingml/2006/main">
+                  <a:graphicData uri="http://schemas.microsoft.com/office/word/2010/wordprocessingShape">
+                    <wps:wsp>
+                      <wps:cNvSpPr txBox="1"/>
+                      <wps:spPr>
+                        <a:xfrm>
+                          <a:off x="0" y="0"/>
+                          <a:ext cx="2513965" cy="342900"/>
+                        </a:xfrm>
+                        <a:prstGeom prst="rect">
+                          <a:avLst/>
+                        </a:prstGeom>
+                        <a:noFill/>
+                        <a:ln w="6350">
+                          <a:noFill/>
+                        </a:ln>
+                        <a:effectLst/>
+                      </wps:spPr>
+                      <wps:style>
+                        <a:lnRef idx="0">
+                          <a:schemeClr val="accent1"/>
+                        </a:lnRef>
+                        <a:fillRef idx="0">
+                          <a:schemeClr val="accent1"/>
+                        </a:fillRef>
+                        <a:effectRef idx="0">
+                          <a:schemeClr val="accent1"/>
+                        </a:effectRef>
+                        <a:fontRef idx="minor">
+                          <a:schemeClr val="dk1"/>
+                        </a:fontRef>
+                      </wps:style>
+                      <wps:txbx>
+                        <w:txbxContent>
+                          <w:p>
+                            <w:pPr>
+                              <w:spacing w:after="0" w:line="240" w:lineRule="auto"/>
+                              <w:jc w:val="center"/>
+                              <w:rPr>
+                                <w:rFonts w:hint="default" w:ascii="Arial" w:hAnsi="Arial" w:eastAsia="Times New Roman" w:cs="Arial"/>
+                                <w:color w:val="000000"/>
+                                <w:sz w:val="20"/>
+                                <w:szCs w:val="20"/>
+                                <w:lang w:val="en-US"/>
+                              </w:rPr>
+                            </w:pPr>
+                            <w:r>
+                              <w:rPr>
+                                <w:rFonts w:hint="default" w:ascii="Arial" w:hAnsi="Arial" w:eastAsia="Times New Roman" w:cs="Arial"/>
+                                <w:color w:val="000000"/>
+                                <w:sz w:val="20"/>
+                                <w:szCs w:val="20"/>
+                                <w:lang w:val="en-US"/>
+                              </w:rPr>
+                              <w:t>{CLEARANCE_VALIDITY}.</w:t>
+                            </w:r>
+                          </w:p>
+                        </w:txbxContent>
+                      </wps:txbx>
+                      <wps:bodyPr rot="0" spcFirstLastPara="0" vertOverflow="overflow" horzOverflow="overflow" vert="horz" wrap="square" lIns="91440" tIns="45720" rIns="91440" bIns="45720" numCol="1" spcCol="0" rtlCol="0" fromWordArt="0" anchor="t" anchorCtr="0" forceAA="0" compatLnSpc="1">
+                        <a:noAutofit/>
+                      </wps:bodyPr>
+                    </wps:wsp>
+                  </a:graphicData>
+                </a:graphic>
+              </wp:anchor>
+            </w:drawing>
+          </mc:Choice>
+          <mc:Fallback>
+            <w:pict>
+              <v:shape id="_x0000_s1026" o:spid="_x0000_s1026" o:spt="202" type="#_x0000_t202" style="position:absolute;left:0pt;margin-left:172.05pt;margin-top:0.8pt;height:27pt;width:197.95pt;z-index:251723776;mso-width-relative:page;mso-height-relative:page;" filled="f" stroked="f" coordsize="21600,21600" o:gfxdata="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">
+                <v:fill on="f" focussize="0,0"/>
+                <v:stroke on="f" weight="0.5pt"/>
+                <v:imagedata o:title=""/>
+                <o:lock v:ext="edit" aspectratio="f"/>
+                <v:textbox>
+                  <w:txbxContent>
+                    <w:p>
+                      <w:pPr>
+                        <w:spacing w:after="0" w:line="240" w:lineRule="auto"/>
+                        <w:jc w:val="center"/>
+                        <w:rPr>
+                          <w:rFonts w:hint="default" w:ascii="Arial" w:hAnsi="Arial" w:eastAsia="Times New Roman" w:cs="Arial"/>
+                          <w:color w:val="000000"/>
+                          <w:sz w:val="20"/>
+                          <w:szCs w:val="20"/>
+                          <w:lang w:val="en-US"/>
+                        </w:rPr>
+                      </w:pPr>
+                      <w:r>
+                        <w:rPr>
+                          <w:rFonts w:hint="default" w:ascii="Arial" w:hAnsi="Arial" w:eastAsia="Times New Roman" w:cs="Arial"/>
+                          <w:color w:val="000000"/>
+                          <w:sz w:val="20"/>
+                          <w:szCs w:val="20"/>
+                          <w:lang w:val="en-US"/>
+                        </w:rPr>
+                        <w:t>{CLEARANCE_VALIDITY}.</w:t>
+                      </w:r>
+                    </w:p>
+                  </w:txbxContent>
+                </v:textbox>
+              </v:shape>
+            </w:pict>
+          </mc:Fallback>
+        </mc:AlternateContent>
+      </w:r>
     </w:p>
     <w:p>
       <w:pPr>
@@ -7379,20 +7513,79 @@
       <w:r>
         <w:rPr>
           <w:rFonts w:ascii="Arial" w:hAnsi="Arial" w:cs="Arial"/>
+          <w:sz w:val="24"/>
+          <w:szCs w:val="24"/>
+          <w:lang w:val="en-US" w:eastAsia="en-US"/>
+        </w:rPr>
+        <mc:AlternateContent>
+          <mc:Choice Requires="wps">
+            <w:drawing>
+              <wp:anchor distT="0" distB="0" distL="114300" distR="114300" simplePos="0" relativeHeight="251724800" behindDoc="0" locked="0" layoutInCell="1" allowOverlap="1">
+                <wp:simplePos x="0" y="0"/>
+                <wp:positionH relativeFrom="column">
+                  <wp:posOffset>2702560</wp:posOffset>
+                </wp:positionH>
+                <wp:positionV relativeFrom="paragraph">
+                  <wp:posOffset>135890</wp:posOffset>
+                </wp:positionV>
+                <wp:extent cx="1509395" cy="635"/>
+                <wp:effectExtent l="0" t="0" r="0" b="0"/>
+                <wp:wrapNone/>
+                <wp:docPr id="58" name="Straight Connector 22"/>
+                <wp:cNvGraphicFramePr/>
+                <a:graphic xmlns:a="http://schemas.openxmlformats.org/drawingml/2006/main">
+                  <a:graphicData uri="http://schemas.microsoft.com/office/word/2010/wordprocessingShape">
+                    <wps:wsp>
+                      <wps:cNvCnPr/>
+                      <wps:spPr>
+                        <a:xfrm flipV="1">
+                          <a:off x="0" y="0"/>
+                          <a:ext cx="1509395" cy="635"/>
+                        </a:xfrm>
+                        <a:prstGeom prst="line">
+                          <a:avLst/>
+                        </a:prstGeom>
+                      </wps:spPr>
+                      <wps:style>
+                        <a:lnRef idx="1">
+                          <a:schemeClr val="dk1"/>
+                        </a:lnRef>
+                        <a:fillRef idx="0">
+                          <a:schemeClr val="dk1"/>
+                        </a:fillRef>
+                        <a:effectRef idx="0">
+                          <a:schemeClr val="dk1"/>
+                        </a:effectRef>
+                        <a:fontRef idx="minor">
+                          <a:schemeClr val="tx1"/>
+                        </a:fontRef>
+                      </wps:style>
+                      <wps:bodyPr/>
+                    </wps:wsp>
+                  </a:graphicData>
+                </a:graphic>
+              </wp:anchor>
+            </w:drawing>
+          </mc:Choice>
+          <mc:Fallback>
+            <w:pict>
+              <v:line id="Straight Connector 22" o:spid="_x0000_s1026" o:spt="20" style="position:absolute;left:0pt;flip:y;margin-left:212.8pt;margin-top:10.7pt;height:0.05pt;width:118.85pt;z-index:251724800;mso-width-relative:page;mso-height-relative:page;" filled="f" stroked="t" coordsize="21600,21600" o:gfxdata="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">
+                <v:fill on="f" focussize="0,0"/>
+                <v:stroke color="#000000 [3200]" joinstyle="round"/>
+                <v:imagedata o:title=""/>
+                <o:lock v:ext="edit" aspectratio="f"/>
+              </v:line>
+            </w:pict>
+          </mc:Fallback>
+        </mc:AlternateContent>
+      </w:r>
+      <w:r>
+        <w:rPr>
+          <w:rFonts w:ascii="Arial" w:hAnsi="Arial" w:cs="Arial"/>
           <w:sz w:val="20"/>
           <w:szCs w:val="20"/>
         </w:rPr>
         <w:t xml:space="preserve">This clearance is valid until </w:t>
-      </w:r>
-      <w:r>
-        <w:rPr>
-          <w:rFonts w:ascii="Arial" w:hAnsi="Arial" w:cs="Arial"/>
-          <w:i/>
-          <w:sz w:val="16"/>
-          <w:szCs w:val="16"/>
-          <w:u w:val="single"/>
-        </w:rPr>
-        <w:t>__(Date)_/_(Month)_/_(Year)_</w:t>
       </w:r>
     </w:p>
     <w:p>
@@ -7528,7 +7721,26 @@
           <w:sz w:val="20"/>
           <w:szCs w:val="20"/>
         </w:rPr>
-        <w:t xml:space="preserve">     RECOMMEND APPROVAL:</w:t>
+        <w:t xml:space="preserve">     </w:t>
+      </w:r>
+      <w:r>
+        <w:rPr>
+          <w:rFonts w:hint="default" w:ascii="Arial" w:hAnsi="Arial" w:cs="Arial"/>
+          <w:b/>
+          <w:sz w:val="20"/>
+          <w:szCs w:val="20"/>
+          <w:lang w:val="en-US"/>
+        </w:rPr>
+        <w:tab/>
+      </w:r>
+      <w:r>
+        <w:rPr>
+          <w:rFonts w:ascii="Arial" w:hAnsi="Arial" w:cs="Arial"/>
+          <w:b/>
+          <w:sz w:val="20"/>
+          <w:szCs w:val="20"/>
+        </w:rPr>
+        <w:t>RECOMMEND APPROVAL:</w:t>
       </w:r>
     </w:p>
     <w:p>
@@ -7542,6 +7754,210 @@
           <w:szCs w:val="20"/>
         </w:rPr>
       </w:pPr>
+      <w:r>
+        <w:rPr>
+          <w:rFonts w:ascii="Arial" w:hAnsi="Arial" w:cs="Arial"/>
+          <w:sz w:val="24"/>
+          <w:szCs w:val="24"/>
+          <w:lang w:val="en-US" w:eastAsia="en-US"/>
+        </w:rPr>
+        <mc:AlternateContent>
+          <mc:Choice Requires="wps">
+            <w:drawing>
+              <wp:anchor distT="0" distB="0" distL="114300" distR="114300" simplePos="0" relativeHeight="251718656" behindDoc="1" locked="0" layoutInCell="1" allowOverlap="1">
+                <wp:simplePos x="0" y="0"/>
+                <wp:positionH relativeFrom="column">
+                  <wp:posOffset>4120515</wp:posOffset>
+                </wp:positionH>
+                <wp:positionV relativeFrom="paragraph">
+                  <wp:posOffset>36195</wp:posOffset>
+                </wp:positionV>
+                <wp:extent cx="3061970" cy="486410"/>
+                <wp:effectExtent l="0" t="0" r="0" b="0"/>
+                <wp:wrapNone/>
+                <wp:docPr id="61" name="Text Box 61"/>
+                <wp:cNvGraphicFramePr/>
+                <a:graphic xmlns:a="http://schemas.openxmlformats.org/drawingml/2006/main">
+                  <a:graphicData uri="http://schemas.microsoft.com/office/word/2010/wordprocessingShape">
+                    <wps:wsp>
+                      <wps:cNvSpPr txBox="1"/>
+                      <wps:spPr>
+                        <a:xfrm>
+                          <a:off x="0" y="0"/>
+                          <a:ext cx="3061970" cy="486410"/>
+                        </a:xfrm>
+                        <a:prstGeom prst="rect">
+                          <a:avLst/>
+                        </a:prstGeom>
+                        <a:noFill/>
+                        <a:ln w="6350">
+                          <a:noFill/>
+                        </a:ln>
+                        <a:effectLst/>
+                      </wps:spPr>
+                      <wps:style>
+                        <a:lnRef idx="0">
+                          <a:schemeClr val="accent1"/>
+                        </a:lnRef>
+                        <a:fillRef idx="0">
+                          <a:schemeClr val="accent1"/>
+                        </a:fillRef>
+                        <a:effectRef idx="0">
+                          <a:schemeClr val="accent1"/>
+                        </a:effectRef>
+                        <a:fontRef idx="minor">
+                          <a:schemeClr val="dk1"/>
+                        </a:fontRef>
+                      </wps:style>
+                      <wps:txbx>
+                        <w:txbxContent>
+                          <w:p>
+                            <w:pPr>
+                              <w:spacing w:after="0" w:afterLines="31" w:afterAutospacing="0" w:line="240" w:lineRule="auto"/>
+                              <w:jc w:val="center"/>
+                              <w:rPr>
+                                <w:rFonts w:hint="default" w:ascii="Arial" w:hAnsi="Arial" w:cs="Arial"/>
+                                <w:b w:val="0"/>
+                                <w:bCs w:val="0"/>
+                                <w:sz w:val="20"/>
+                                <w:szCs w:val="20"/>
+                                <w:u w:val="none"/>
+                                <w:lang w:val="en-US"/>
+                              </w:rPr>
+                            </w:pPr>
+                            <w:r>
+                              <w:rPr>
+                                <w:rFonts w:hint="default" w:ascii="Arial" w:hAnsi="Arial" w:cs="Arial"/>
+                                <w:b w:val="0"/>
+                                <w:bCs w:val="0"/>
+                                <w:sz w:val="20"/>
+                                <w:szCs w:val="20"/>
+                                <w:u w:val="none"/>
+                                <w:lang w:val="en-US"/>
+                              </w:rPr>
+                              <w:t>{CHIEF}</w:t>
+                            </w:r>
+                          </w:p>
+                          <w:p>
+                            <w:pPr>
+                              <w:jc w:val="center"/>
+                              <w:rPr>
+                                <w:rFonts w:hint="default" w:ascii="Arial" w:hAnsi="Arial" w:cs="Arial"/>
+                                <w:b/>
+                                <w:bCs/>
+                                <w:sz w:val="20"/>
+                                <w:szCs w:val="20"/>
+                              </w:rPr>
+                            </w:pPr>
+                            <w:r>
+                              <w:rPr>
+                                <w:rFonts w:hint="default" w:ascii="Arial" w:hAnsi="Arial" w:eastAsia="SimSun" w:cs="Arial"/>
+                                <w:b/>
+                                <w:bCs/>
+                                <w:sz w:val="20"/>
+                                <w:szCs w:val="20"/>
+                              </w:rPr>
+                              <w:t>CHIEF_POSITION</w:t>
+                            </w:r>
+                          </w:p>
+                          <w:p>
+                            <w:pPr>
+                              <w:spacing w:beforeAutospacing="0" w:after="0" w:afterAutospacing="0" w:line="240" w:lineRule="auto"/>
+                              <w:jc w:val="center"/>
+                              <w:rPr>
+                                <w:rFonts w:cstheme="minorHAnsi"/>
+                                <w:b/>
+                                <w:u w:val="single"/>
+                              </w:rPr>
+                            </w:pPr>
+                          </w:p>
+                        </w:txbxContent>
+                      </wps:txbx>
+                      <wps:bodyPr rot="0" spcFirstLastPara="0" vertOverflow="overflow" horzOverflow="overflow" vert="horz" wrap="square" lIns="91440" tIns="45720" rIns="91440" bIns="45720" numCol="1" spcCol="0" rtlCol="0" fromWordArt="0" anchor="t" anchorCtr="0" forceAA="0" compatLnSpc="1">
+                        <a:noAutofit/>
+                      </wps:bodyPr>
+                    </wps:wsp>
+                  </a:graphicData>
+                </a:graphic>
+              </wp:anchor>
+            </w:drawing>
+          </mc:Choice>
+          <mc:Fallback>
+            <w:pict>
+              <v:shape id="_x0000_s1026" o:spid="_x0000_s1026" o:spt="202" type="#_x0000_t202" style="position:absolute;left:0pt;margin-left:324.45pt;margin-top:2.85pt;height:38.3pt;width:241.1pt;z-index:-251597824;mso-width-relative:page;mso-height-relative:page;" filled="f" stroked="f" coordsize="21600,21600" o:gfxdata="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">
+                <v:fill on="f" focussize="0,0"/>
+                <v:stroke on="f" weight="0.5pt"/>
+                <v:imagedata o:title=""/>
+                <o:lock v:ext="edit" aspectratio="f"/>
+                <v:textbox>
+                  <w:txbxContent>
+                    <w:p>
+                      <w:pPr>
+                        <w:spacing w:after="0" w:afterLines="31" w:afterAutospacing="0" w:line="240" w:lineRule="auto"/>
+                        <w:jc w:val="center"/>
+                        <w:rPr>
+                          <w:rFonts w:hint="default" w:ascii="Arial" w:hAnsi="Arial" w:cs="Arial"/>
+                          <w:b w:val="0"/>
+                          <w:bCs w:val="0"/>
+                          <w:sz w:val="20"/>
+                          <w:szCs w:val="20"/>
+                          <w:u w:val="none"/>
+                          <w:lang w:val="en-US"/>
+                        </w:rPr>
+                      </w:pPr>
+                      <w:r>
+                        <w:rPr>
+                          <w:rFonts w:hint="default" w:ascii="Arial" w:hAnsi="Arial" w:cs="Arial"/>
+                          <w:b w:val="0"/>
+                          <w:bCs w:val="0"/>
+                          <w:sz w:val="20"/>
+                          <w:szCs w:val="20"/>
+                          <w:u w:val="none"/>
+                          <w:lang w:val="en-US"/>
+                        </w:rPr>
+                        <w:t>{CHIEF}</w:t>
+                      </w:r>
+                    </w:p>
+                    <w:p>
+                      <w:pPr>
+                        <w:jc w:val="center"/>
+                        <w:rPr>
+                          <w:rFonts w:hint="default" w:ascii="Arial" w:hAnsi="Arial" w:cs="Arial"/>
+                          <w:b/>
+                          <w:bCs/>
+                          <w:sz w:val="20"/>
+                          <w:szCs w:val="20"/>
+                        </w:rPr>
+                      </w:pPr>
+                      <w:r>
+                        <w:rPr>
+                          <w:rFonts w:hint="default" w:ascii="Arial" w:hAnsi="Arial" w:eastAsia="SimSun" w:cs="Arial"/>
+                          <w:b/>
+                          <w:bCs/>
+                          <w:sz w:val="20"/>
+                          <w:szCs w:val="20"/>
+                        </w:rPr>
+                        <w:t>CHIEF_POSITION</w:t>
+                      </w:r>
+                    </w:p>
+                    <w:p>
+                      <w:pPr>
+                        <w:spacing w:beforeAutospacing="0" w:after="0" w:afterAutospacing="0" w:line="240" w:lineRule="auto"/>
+                        <w:jc w:val="center"/>
+                        <w:rPr>
+                          <w:rFonts w:cstheme="minorHAnsi"/>
+                          <w:b/>
+                          <w:u w:val="single"/>
+                        </w:rPr>
+                      </w:pPr>
+                    </w:p>
+                  </w:txbxContent>
+                </v:textbox>
+              </v:shape>
+            </w:pict>
+          </mc:Fallback>
+        </mc:AlternateContent>
+      </w:r>
       <w:r>
         <w:rPr>
           <w:rFonts w:ascii="Arial" w:hAnsi="Arial" w:cs="Arial"/>
@@ -7614,204 +8030,6 @@
       <w:r>
         <w:rPr>
           <w:rFonts w:ascii="Arial" w:hAnsi="Arial" w:cs="Arial"/>
-          <w:sz w:val="24"/>
-          <w:szCs w:val="24"/>
-          <w:lang w:val="en-US" w:eastAsia="en-US"/>
-        </w:rPr>
-        <mc:AlternateContent>
-          <mc:Choice Requires="wps">
-            <w:drawing>
-              <wp:anchor distT="0" distB="0" distL="114300" distR="114300" simplePos="0" relativeHeight="251718656" behindDoc="1" locked="0" layoutInCell="1" allowOverlap="1">
-                <wp:simplePos x="0" y="0"/>
-                <wp:positionH relativeFrom="column">
-                  <wp:posOffset>3057525</wp:posOffset>
-                </wp:positionH>
-                <wp:positionV relativeFrom="paragraph">
-                  <wp:posOffset>52705</wp:posOffset>
-                </wp:positionV>
-                <wp:extent cx="3061970" cy="486410"/>
-                <wp:effectExtent l="0" t="0" r="0" b="0"/>
-                <wp:wrapNone/>
-                <wp:docPr id="61" name="Text Box 61"/>
-                <wp:cNvGraphicFramePr/>
-                <a:graphic xmlns:a="http://schemas.openxmlformats.org/drawingml/2006/main">
-                  <a:graphicData uri="http://schemas.microsoft.com/office/word/2010/wordprocessingShape">
-                    <wps:wsp>
-                      <wps:cNvSpPr txBox="1"/>
-                      <wps:spPr>
-                        <a:xfrm>
-                          <a:off x="0" y="0"/>
-                          <a:ext cx="3061970" cy="486410"/>
-                        </a:xfrm>
-                        <a:prstGeom prst="rect">
-                          <a:avLst/>
-                        </a:prstGeom>
-                        <a:noFill/>
-                        <a:ln w="6350">
-                          <a:noFill/>
-                        </a:ln>
-                        <a:effectLst/>
-                      </wps:spPr>
-                      <wps:style>
-                        <a:lnRef idx="0">
-                          <a:schemeClr val="accent1"/>
-                        </a:lnRef>
-                        <a:fillRef idx="0">
-                          <a:schemeClr val="accent1"/>
-                        </a:fillRef>
-                        <a:effectRef idx="0">
-                          <a:schemeClr val="accent1"/>
-                        </a:effectRef>
-                        <a:fontRef idx="minor">
-                          <a:schemeClr val="dk1"/>
-                        </a:fontRef>
-                      </wps:style>
-                      <wps:txbx>
-                        <w:txbxContent>
-                          <w:p>
-                            <w:pPr>
-                              <w:spacing w:after="0" w:afterLines="31" w:afterAutospacing="0" w:line="240" w:lineRule="auto"/>
-                              <w:jc w:val="center"/>
-                              <w:rPr>
-                                <w:rFonts w:hint="default" w:ascii="Arial" w:hAnsi="Arial" w:cs="Arial"/>
-                                <w:b/>
-                                <w:bCs/>
-                                <w:sz w:val="20"/>
-                                <w:szCs w:val="20"/>
-                                <w:u w:val="none"/>
-                                <w:lang w:val="en-US"/>
-                              </w:rPr>
-                            </w:pPr>
-                            <w:r>
-                              <w:rPr>
-                                <w:rFonts w:hint="default" w:ascii="Arial" w:hAnsi="Arial" w:cs="Arial"/>
-                                <w:b/>
-                                <w:bCs/>
-                                <w:sz w:val="20"/>
-                                <w:szCs w:val="20"/>
-                                <w:u w:val="none"/>
-                                <w:lang w:val="en-US"/>
-                              </w:rPr>
-                              <w:t>{CHIEF}</w:t>
-                            </w:r>
-                          </w:p>
-                          <w:p>
-                            <w:pPr>
-                              <w:jc w:val="center"/>
-                              <w:rPr>
-                                <w:rFonts w:hint="default" w:ascii="Arial" w:hAnsi="Arial" w:cs="Arial"/>
-                                <w:b/>
-                                <w:sz w:val="20"/>
-                                <w:szCs w:val="20"/>
-                              </w:rPr>
-                            </w:pPr>
-                            <w:r>
-                              <w:rPr>
-                                <w:rFonts w:hint="default" w:ascii="Arial" w:hAnsi="Arial" w:eastAsia="SimSun" w:cs="Arial"/>
-                                <w:sz w:val="20"/>
-                                <w:szCs w:val="20"/>
-                              </w:rPr>
-                              <w:t>{CHIEF_POSITION}</w:t>
-                            </w:r>
-                          </w:p>
-                          <w:p>
-                            <w:pPr>
-                              <w:spacing w:beforeAutospacing="0" w:after="0" w:afterAutospacing="0" w:line="240" w:lineRule="auto"/>
-                              <w:jc w:val="center"/>
-                              <w:rPr>
-                                <w:rFonts w:cstheme="minorHAnsi"/>
-                                <w:b/>
-                                <w:u w:val="single"/>
-                              </w:rPr>
-                            </w:pPr>
-                          </w:p>
-                        </w:txbxContent>
-                      </wps:txbx>
-                      <wps:bodyPr rot="0" spcFirstLastPara="0" vertOverflow="overflow" horzOverflow="overflow" vert="horz" wrap="square" lIns="91440" tIns="45720" rIns="91440" bIns="45720" numCol="1" spcCol="0" rtlCol="0" fromWordArt="0" anchor="t" anchorCtr="0" forceAA="0" compatLnSpc="1">
-                        <a:noAutofit/>
-                      </wps:bodyPr>
-                    </wps:wsp>
-                  </a:graphicData>
-                </a:graphic>
-              </wp:anchor>
-            </w:drawing>
-          </mc:Choice>
-          <mc:Fallback>
-            <w:pict>
-              <v:shape id="_x0000_s1026" o:spid="_x0000_s1026" o:spt="202" type="#_x0000_t202" style="position:absolute;left:0pt;margin-left:240.75pt;margin-top:4.15pt;height:38.3pt;width:241.1pt;z-index:-251597824;mso-width-relative:page;mso-height-relative:page;" filled="f" stroked="f" coordsize="21600,21600" o:gfxdata="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">
-                <v:fill on="f" focussize="0,0"/>
-                <v:stroke on="f" weight="0.5pt"/>
-                <v:imagedata o:title=""/>
-                <o:lock v:ext="edit" aspectratio="f"/>
-                <v:textbox>
-                  <w:txbxContent>
-                    <w:p>
-                      <w:pPr>
-                        <w:spacing w:after="0" w:afterLines="31" w:afterAutospacing="0" w:line="240" w:lineRule="auto"/>
-                        <w:jc w:val="center"/>
-                        <w:rPr>
-                          <w:rFonts w:hint="default" w:ascii="Arial" w:hAnsi="Arial" w:cs="Arial"/>
-                          <w:b/>
-                          <w:bCs/>
-                          <w:sz w:val="20"/>
-                          <w:szCs w:val="20"/>
-                          <w:u w:val="none"/>
-                          <w:lang w:val="en-US"/>
-                        </w:rPr>
-                      </w:pPr>
-                      <w:r>
-                        <w:rPr>
-                          <w:rFonts w:hint="default" w:ascii="Arial" w:hAnsi="Arial" w:cs="Arial"/>
-                          <w:b/>
-                          <w:bCs/>
-                          <w:sz w:val="20"/>
-                          <w:szCs w:val="20"/>
-                          <w:u w:val="none"/>
-                          <w:lang w:val="en-US"/>
-                        </w:rPr>
-                        <w:t>{CHIEF}</w:t>
-                      </w:r>
-                    </w:p>
-                    <w:p>
-                      <w:pPr>
-                        <w:jc w:val="center"/>
-                        <w:rPr>
-                          <w:rFonts w:hint="default" w:ascii="Arial" w:hAnsi="Arial" w:cs="Arial"/>
-                          <w:b/>
-                          <w:sz w:val="20"/>
-                          <w:szCs w:val="20"/>
-                        </w:rPr>
-                      </w:pPr>
-                      <w:r>
-                        <w:rPr>
-                          <w:rFonts w:hint="default" w:ascii="Arial" w:hAnsi="Arial" w:eastAsia="SimSun" w:cs="Arial"/>
-                          <w:sz w:val="20"/>
-                          <w:szCs w:val="20"/>
-                        </w:rPr>
-                        <w:t>{CHIEF_POSITION}</w:t>
-                      </w:r>
-                    </w:p>
-                    <w:p>
-                      <w:pPr>
-                        <w:spacing w:beforeAutospacing="0" w:after="0" w:afterAutospacing="0" w:line="240" w:lineRule="auto"/>
-                        <w:jc w:val="center"/>
-                        <w:rPr>
-                          <w:rFonts w:cstheme="minorHAnsi"/>
-                          <w:b/>
-                          <w:u w:val="single"/>
-                        </w:rPr>
-                      </w:pPr>
-                    </w:p>
-                  </w:txbxContent>
-                </v:textbox>
-              </v:shape>
-            </w:pict>
-          </mc:Fallback>
-        </mc:AlternateContent>
-      </w:r>
-      <w:r>
-        <w:rPr>
-          <w:rFonts w:ascii="Arial" w:hAnsi="Arial" w:cs="Arial"/>
           <w:sz w:val="20"/>
           <w:szCs w:val="20"/>
         </w:rPr>
@@ -7903,6 +8121,75 @@
           <w:szCs w:val="20"/>
         </w:rPr>
       </w:pPr>
+      <w:r>
+        <w:rPr>
+          <w:rFonts w:ascii="Arial" w:hAnsi="Arial" w:cs="Arial"/>
+          <w:sz w:val="24"/>
+          <w:szCs w:val="24"/>
+          <w:lang w:val="en-US" w:eastAsia="en-US"/>
+        </w:rPr>
+        <mc:AlternateContent>
+          <mc:Choice Requires="wps">
+            <w:drawing>
+              <wp:anchor distT="0" distB="0" distL="114300" distR="114300" simplePos="0" relativeHeight="251722752" behindDoc="0" locked="0" layoutInCell="1" allowOverlap="1">
+                <wp:simplePos x="0" y="0"/>
+                <wp:positionH relativeFrom="column">
+                  <wp:posOffset>4433570</wp:posOffset>
+                </wp:positionH>
+                <wp:positionV relativeFrom="paragraph">
+                  <wp:posOffset>85090</wp:posOffset>
+                </wp:positionV>
+                <wp:extent cx="2308225" cy="10795"/>
+                <wp:effectExtent l="0" t="4445" r="15875" b="13335"/>
+                <wp:wrapNone/>
+                <wp:docPr id="62" name="Straight Connector 22"/>
+                <wp:cNvGraphicFramePr/>
+                <a:graphic xmlns:a="http://schemas.openxmlformats.org/drawingml/2006/main">
+                  <a:graphicData uri="http://schemas.microsoft.com/office/word/2010/wordprocessingShape">
+                    <wps:wsp>
+                      <wps:cNvCnPr/>
+                      <wps:spPr>
+                        <a:xfrm flipV="1">
+                          <a:off x="0" y="0"/>
+                          <a:ext cx="2308225" cy="10795"/>
+                        </a:xfrm>
+                        <a:prstGeom prst="line">
+                          <a:avLst/>
+                        </a:prstGeom>
+                      </wps:spPr>
+                      <wps:style>
+                        <a:lnRef idx="1">
+                          <a:schemeClr val="dk1"/>
+                        </a:lnRef>
+                        <a:fillRef idx="0">
+                          <a:schemeClr val="dk1"/>
+                        </a:fillRef>
+                        <a:effectRef idx="0">
+                          <a:schemeClr val="dk1"/>
+                        </a:effectRef>
+                        <a:fontRef idx="minor">
+                          <a:schemeClr val="tx1"/>
+                        </a:fontRef>
+                      </wps:style>
+                      <wps:bodyPr/>
+                    </wps:wsp>
+                  </a:graphicData>
+                </a:graphic>
+              </wp:anchor>
+            </w:drawing>
+          </mc:Choice>
+          <mc:Fallback>
+            <w:pict>
+              <v:line id="Straight Connector 22" o:spid="_x0000_s1026" o:spt="20" style="position:absolute;left:0pt;flip:y;margin-left:349.1pt;margin-top:6.7pt;height:0.85pt;width:181.75pt;z-index:251722752;mso-width-relative:page;mso-height-relative:page;" filled="f" stroked="t" coordsize="21600,21600" o:gfxdata="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">
+                <v:fill on="f" focussize="0,0"/>
+                <v:stroke color="#000000 [3200]" joinstyle="round"/>
+                <v:imagedata o:title=""/>
+                <o:lock v:ext="edit" aspectratio="f"/>
+              </v:line>
+            </w:pict>
+          </mc:Fallback>
+        </mc:AlternateContent>
+      </w:r>
       <w:r>
         <w:rPr>
           <w:rFonts w:ascii="Arial" w:hAnsi="Arial" w:cs="Arial"/>
@@ -7975,75 +8262,6 @@
       <w:r>
         <w:rPr>
           <w:rFonts w:ascii="Arial" w:hAnsi="Arial" w:cs="Arial"/>
-          <w:sz w:val="24"/>
-          <w:szCs w:val="24"/>
-          <w:lang w:val="en-US" w:eastAsia="en-US"/>
-        </w:rPr>
-        <mc:AlternateContent>
-          <mc:Choice Requires="wps">
-            <w:drawing>
-              <wp:anchor distT="0" distB="0" distL="114300" distR="114300" simplePos="0" relativeHeight="251722752" behindDoc="0" locked="0" layoutInCell="1" allowOverlap="1">
-                <wp:simplePos x="0" y="0"/>
-                <wp:positionH relativeFrom="column">
-                  <wp:posOffset>3418840</wp:posOffset>
-                </wp:positionH>
-                <wp:positionV relativeFrom="paragraph">
-                  <wp:posOffset>78740</wp:posOffset>
-                </wp:positionV>
-                <wp:extent cx="2308225" cy="10795"/>
-                <wp:effectExtent l="0" t="4445" r="15875" b="13335"/>
-                <wp:wrapNone/>
-                <wp:docPr id="62" name="Straight Connector 22"/>
-                <wp:cNvGraphicFramePr/>
-                <a:graphic xmlns:a="http://schemas.openxmlformats.org/drawingml/2006/main">
-                  <a:graphicData uri="http://schemas.microsoft.com/office/word/2010/wordprocessingShape">
-                    <wps:wsp>
-                      <wps:cNvCnPr/>
-                      <wps:spPr>
-                        <a:xfrm flipV="1">
-                          <a:off x="0" y="0"/>
-                          <a:ext cx="2308225" cy="10795"/>
-                        </a:xfrm>
-                        <a:prstGeom prst="line">
-                          <a:avLst/>
-                        </a:prstGeom>
-                      </wps:spPr>
-                      <wps:style>
-                        <a:lnRef idx="1">
-                          <a:schemeClr val="dk1"/>
-                        </a:lnRef>
-                        <a:fillRef idx="0">
-                          <a:schemeClr val="dk1"/>
-                        </a:fillRef>
-                        <a:effectRef idx="0">
-                          <a:schemeClr val="dk1"/>
-                        </a:effectRef>
-                        <a:fontRef idx="minor">
-                          <a:schemeClr val="tx1"/>
-                        </a:fontRef>
-                      </wps:style>
-                      <wps:bodyPr/>
-                    </wps:wsp>
-                  </a:graphicData>
-                </a:graphic>
-              </wp:anchor>
-            </w:drawing>
-          </mc:Choice>
-          <mc:Fallback>
-            <w:pict>
-              <v:line id="Straight Connector 22" o:spid="_x0000_s1026" o:spt="20" style="position:absolute;left:0pt;flip:y;margin-left:269.2pt;margin-top:6.2pt;height:0.85pt;width:181.75pt;z-index:251722752;mso-width-relative:page;mso-height-relative:page;" filled="f" stroked="t" coordsize="21600,21600" o:gfxdata="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">
-                <v:fill on="f" focussize="0,0"/>
-                <v:stroke color="#000000 [3200]" joinstyle="round"/>
-                <v:imagedata o:title=""/>
-                <o:lock v:ext="edit" aspectratio="f"/>
-              </v:line>
-            </w:pict>
-          </mc:Fallback>
-        </mc:AlternateContent>
-      </w:r>
-      <w:r>
-        <w:rPr>
-          <w:rFonts w:ascii="Arial" w:hAnsi="Arial" w:cs="Arial"/>
           <w:sz w:val="20"/>
           <w:szCs w:val="20"/>
         </w:rPr>
@@ -8511,7 +8729,8 @@
       </w:r>
       <w:r>
         <w:rPr>
-          <w:rFonts w:ascii="Arial Narrow" w:hAnsi="Arial Narrow" w:cs="Arial"/>
+          <w:rFonts w:hint="default" w:ascii="Arial Narrow" w:hAnsi="Arial Narrow" w:cs="Arial"/>
+          <w:lang w:val="en-US"/>
         </w:rPr>
         <w:tab/>
       </w:r>
@@ -8550,10 +8769,10 @@
               <wp:anchor distT="0" distB="0" distL="114300" distR="114300" simplePos="0" relativeHeight="251717632" behindDoc="0" locked="0" layoutInCell="1" allowOverlap="1">
                 <wp:simplePos x="0" y="0"/>
                 <wp:positionH relativeFrom="column">
-                  <wp:posOffset>3467735</wp:posOffset>
+                  <wp:posOffset>4284345</wp:posOffset>
                 </wp:positionH>
                 <wp:positionV relativeFrom="paragraph">
-                  <wp:posOffset>78105</wp:posOffset>
+                  <wp:posOffset>64770</wp:posOffset>
                 </wp:positionV>
                 <wp:extent cx="2513965" cy="342900"/>
                 <wp:effectExtent l="0" t="0" r="0" b="0"/>
@@ -8630,7 +8849,7 @@
           </mc:Choice>
           <mc:Fallback>
             <w:pict>
-              <v:shape id="_x0000_s1026" o:spid="_x0000_s1026" o:spt="202" type="#_x0000_t202" style="position:absolute;left:0pt;margin-left:273.05pt;margin-top:6.15pt;height:27pt;width:197.95pt;z-index:251717632;mso-width-relative:page;mso-height-relative:page;" filled="f" stroked="f" coordsize="21600,21600" o:gfxdata="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">
+              <v:shape id="_x0000_s1026" o:spid="_x0000_s1026" o:spt="202" type="#_x0000_t202" style="position:absolute;left:0pt;margin-left:337.35pt;margin-top:5.1pt;height:27pt;width:197.95pt;z-index:251717632;mso-width-relative:page;mso-height-relative:page;" filled="f" stroked="f" coordsize="21600,21600" o:gfxdata="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">
                 <v:fill on="f" focussize="0,0"/>
                 <v:stroke on="f" weight="0.5pt"/>
                 <v:imagedata o:title=""/>
@@ -8671,20 +8890,9 @@
     <w:p>
       <w:pPr>
         <w:spacing w:after="0" w:line="240" w:lineRule="auto"/>
-        <w:ind w:firstLine="720" w:firstLineChars="0"/>
+        <w:ind w:left="720" w:leftChars="0" w:firstLine="720" w:firstLineChars="0"/>
         <w:rPr>
           <w:rFonts w:ascii="Arial Narrow" w:hAnsi="Arial Narrow" w:cs="Arial"/>
-        </w:rPr>
-      </w:pPr>
-    </w:p>
-    <w:p>
-      <w:pPr>
-        <w:spacing w:after="0" w:line="240" w:lineRule="auto"/>
-        <w:ind w:firstLine="720" w:firstLineChars="0"/>
-        <w:rPr>
-          <w:rFonts w:ascii="Arial" w:hAnsi="Arial" w:cs="Arial"/>
-          <w:sz w:val="20"/>
-          <w:szCs w:val="20"/>
         </w:rPr>
       </w:pPr>
       <w:r>
@@ -8698,10 +8906,10 @@
               <wp:anchor distT="0" distB="0" distL="114300" distR="114300" simplePos="0" relativeHeight="251716608" behindDoc="0" locked="0" layoutInCell="1" allowOverlap="1">
                 <wp:simplePos x="0" y="0"/>
                 <wp:positionH relativeFrom="column">
-                  <wp:posOffset>3488690</wp:posOffset>
+                  <wp:posOffset>4330700</wp:posOffset>
                 </wp:positionH>
                 <wp:positionV relativeFrom="paragraph">
-                  <wp:posOffset>1905</wp:posOffset>
+                  <wp:posOffset>150495</wp:posOffset>
                 </wp:positionV>
                 <wp:extent cx="2461260" cy="635"/>
                 <wp:effectExtent l="0" t="0" r="0" b="0"/>
@@ -8744,7 +8952,7 @@
           </mc:Choice>
           <mc:Fallback>
             <w:pict>
-              <v:line id="_x0000_s1026" o:spid="_x0000_s1026" o:spt="20" style="position:absolute;left:0pt;margin-left:274.7pt;margin-top:0.15pt;height:0.05pt;width:193.8pt;z-index:251716608;mso-width-relative:page;mso-height-relative:page;" filled="f" stroked="t" coordsize="21600,21600" o:gfxdata="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">
+              <v:line id="_x0000_s1026" o:spid="_x0000_s1026" o:spt="20" style="position:absolute;left:0pt;margin-left:341pt;margin-top:11.85pt;height:0.05pt;width:193.8pt;z-index:251716608;mso-width-relative:page;mso-height-relative:page;" filled="f" stroked="t" coordsize="21600,21600" o:gfxdata="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">
                 <v:fill on="f" focussize="0,0"/>
                 <v:stroke color="#000000 [3200]" joinstyle="round"/>
                 <v:imagedata o:title=""/>
@@ -8754,15 +8962,32 @@
           </mc:Fallback>
         </mc:AlternateContent>
       </w:r>
+    </w:p>
+    <w:p>
+      <w:pPr>
+        <w:spacing w:after="0" w:line="240" w:lineRule="auto"/>
+        <w:ind w:left="720" w:leftChars="0" w:firstLine="720" w:firstLineChars="0"/>
+        <w:rPr>
+          <w:rFonts w:ascii="Arial" w:hAnsi="Arial" w:cs="Arial"/>
+          <w:b/>
+          <w:bCs/>
+          <w:sz w:val="20"/>
+          <w:szCs w:val="20"/>
+        </w:rPr>
+      </w:pPr>
       <w:r>
         <w:rPr>
           <w:rFonts w:ascii="Arial Narrow" w:hAnsi="Arial Narrow" w:cs="Arial"/>
-        </w:rPr>
-        <w:t xml:space="preserve">                                                                                                                    </w:t>
-      </w:r>
-      <w:r>
-        <w:rPr>
-          <w:rFonts w:ascii="Arial" w:hAnsi="Arial" w:cs="Arial"/>
+          <w:b/>
+          <w:bCs/>
+        </w:rPr>
+        <w:t xml:space="preserve">                                                                                                                   </w:t>
+      </w:r>
+      <w:r>
+        <w:rPr>
+          <w:rFonts w:ascii="Arial" w:hAnsi="Arial" w:cs="Arial"/>
+          <w:b/>
+          <w:bCs/>
           <w:sz w:val="20"/>
           <w:szCs w:val="20"/>
         </w:rPr>

</xml_diff>

<commit_message>
template already adjusted /  some might fix soon
</commit_message>
<xml_diff>
--- a/backend/templates/FSED-34F-Hot-Works.docx
+++ b/backend/templates/FSED-34F-Hot-Works.docx
@@ -7377,7 +7377,7 @@
         <mc:AlternateContent>
           <mc:Choice Requires="wps">
             <w:drawing>
-              <wp:anchor distT="0" distB="0" distL="114300" distR="114300" simplePos="0" relativeHeight="251723776" behindDoc="0" locked="0" layoutInCell="1" allowOverlap="1">
+              <wp:anchor distT="0" distB="0" distL="114300" distR="114300" simplePos="0" relativeHeight="251719680" behindDoc="0" locked="0" layoutInCell="1" allowOverlap="1">
                 <wp:simplePos x="0" y="0"/>
                 <wp:positionH relativeFrom="column">
                   <wp:posOffset>2185035</wp:posOffset>
@@ -7460,7 +7460,7 @@
           </mc:Choice>
           <mc:Fallback>
             <w:pict>
-              <v:shape id="_x0000_s1026" o:spid="_x0000_s1026" o:spt="202" type="#_x0000_t202" style="position:absolute;left:0pt;margin-left:172.05pt;margin-top:0.8pt;height:27pt;width:197.95pt;z-index:251723776;mso-width-relative:page;mso-height-relative:page;" filled="f" stroked="f" coordsize="21600,21600" o:gfxdata="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">
+              <v:shape id="_x0000_s1026" o:spid="_x0000_s1026" o:spt="202" type="#_x0000_t202" style="position:absolute;left:0pt;margin-left:172.05pt;margin-top:0.8pt;height:27pt;width:197.95pt;z-index:251719680;mso-width-relative:page;mso-height-relative:page;" filled="f" stroked="f" coordsize="21600,21600" o:gfxdata="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">
                 <v:fill on="f" focussize="0,0"/>
                 <v:stroke on="f" weight="0.5pt"/>
                 <v:imagedata o:title=""/>
@@ -7518,7 +7518,7 @@
         <mc:AlternateContent>
           <mc:Choice Requires="wps">
             <w:drawing>
-              <wp:anchor distT="0" distB="0" distL="114300" distR="114300" simplePos="0" relativeHeight="251724800" behindDoc="0" locked="0" layoutInCell="1" allowOverlap="1">
+              <wp:anchor distT="0" distB="0" distL="114300" distR="114300" simplePos="0" relativeHeight="251720704" behindDoc="0" locked="0" layoutInCell="1" allowOverlap="1">
                 <wp:simplePos x="0" y="0"/>
                 <wp:positionH relativeFrom="column">
                   <wp:posOffset>2702560</wp:posOffset>
@@ -7567,7 +7567,7 @@
           </mc:Choice>
           <mc:Fallback>
             <w:pict>
-              <v:line id="Straight Connector 22" o:spid="_x0000_s1026" o:spt="20" style="position:absolute;left:0pt;flip:y;margin-left:212.8pt;margin-top:10.7pt;height:0.05pt;width:118.85pt;z-index:251724800;mso-width-relative:page;mso-height-relative:page;" filled="f" stroked="t" coordsize="21600,21600" o:gfxdata="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">
+              <v:line id="Straight Connector 22" o:spid="_x0000_s1026" o:spt="20" style="position:absolute;left:0pt;flip:y;margin-left:212.8pt;margin-top:10.7pt;height:0.05pt;width:118.85pt;z-index:251720704;mso-width-relative:page;mso-height-relative:page;" filled="f" stroked="t" coordsize="21600,21600" o:gfxdata="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">
                 <v:fill on="f" focussize="0,0"/>
                 <v:stroke color="#000000 [3200]" joinstyle="round"/>
                 <v:imagedata o:title=""/>
@@ -7638,7 +7638,7 @@
     <w:p>
       <w:pPr>
         <w:spacing w:after="0" w:line="240" w:lineRule="auto"/>
-        <w:ind w:firstLine="720" w:firstLineChars="0"/>
+        <w:ind w:left="720" w:leftChars="0" w:firstLine="720" w:firstLineChars="0"/>
         <w:jc w:val="both"/>
         <w:rPr>
           <w:rFonts w:ascii="Arial Narrow" w:hAnsi="Arial Narrow" w:cs="Arial"/>
@@ -7658,88 +7658,6 @@
           <w:szCs w:val="20"/>
         </w:rPr>
       </w:pPr>
-      <w:r>
-        <w:rPr>
-          <w:rFonts w:ascii="Arial" w:hAnsi="Arial" w:cs="Arial"/>
-          <w:b/>
-          <w:sz w:val="20"/>
-          <w:szCs w:val="20"/>
-        </w:rPr>
-        <w:t>Fire Code Fees:</w:t>
-      </w:r>
-      <w:r>
-        <w:rPr>
-          <w:rFonts w:ascii="Arial" w:hAnsi="Arial" w:cs="Arial"/>
-          <w:b/>
-          <w:sz w:val="20"/>
-          <w:szCs w:val="20"/>
-        </w:rPr>
-        <w:tab/>
-      </w:r>
-      <w:r>
-        <w:rPr>
-          <w:rFonts w:ascii="Arial" w:hAnsi="Arial" w:cs="Arial"/>
-          <w:b/>
-          <w:sz w:val="20"/>
-          <w:szCs w:val="20"/>
-        </w:rPr>
-        <w:tab/>
-      </w:r>
-      <w:r>
-        <w:rPr>
-          <w:rFonts w:ascii="Arial" w:hAnsi="Arial" w:cs="Arial"/>
-          <w:b/>
-          <w:sz w:val="20"/>
-          <w:szCs w:val="20"/>
-        </w:rPr>
-        <w:tab/>
-      </w:r>
-      <w:r>
-        <w:rPr>
-          <w:rFonts w:ascii="Arial" w:hAnsi="Arial" w:cs="Arial"/>
-          <w:b/>
-          <w:sz w:val="20"/>
-          <w:szCs w:val="20"/>
-        </w:rPr>
-        <w:tab/>
-      </w:r>
-      <w:r>
-        <w:rPr>
-          <w:rFonts w:ascii="Arial" w:hAnsi="Arial" w:cs="Arial"/>
-          <w:b/>
-          <w:sz w:val="20"/>
-          <w:szCs w:val="20"/>
-        </w:rPr>
-        <w:tab/>
-      </w:r>
-      <w:r>
-        <w:rPr>
-          <w:rFonts w:ascii="Arial" w:hAnsi="Arial" w:cs="Arial"/>
-          <w:b/>
-          <w:sz w:val="20"/>
-          <w:szCs w:val="20"/>
-        </w:rPr>
-        <w:t xml:space="preserve">     </w:t>
-      </w:r>
-      <w:r>
-        <w:rPr>
-          <w:rFonts w:hint="default" w:ascii="Arial" w:hAnsi="Arial" w:cs="Arial"/>
-          <w:b/>
-          <w:sz w:val="20"/>
-          <w:szCs w:val="20"/>
-          <w:lang w:val="en-US"/>
-        </w:rPr>
-        <w:tab/>
-      </w:r>
-      <w:r>
-        <w:rPr>
-          <w:rFonts w:ascii="Arial" w:hAnsi="Arial" w:cs="Arial"/>
-          <w:b/>
-          <w:sz w:val="20"/>
-          <w:szCs w:val="20"/>
-        </w:rPr>
-        <w:t>RECOMMEND APPROVAL:</w:t>
-      </w:r>
     </w:p>
     <w:p>
       <w:pPr>
@@ -7752,6 +7670,105 @@
           <w:szCs w:val="20"/>
         </w:rPr>
       </w:pPr>
+    </w:p>
+    <w:p>
+      <w:pPr>
+        <w:spacing w:after="0" w:line="240" w:lineRule="auto"/>
+        <w:ind w:firstLine="720" w:firstLineChars="0"/>
+        <w:rPr>
+          <w:rFonts w:ascii="Arial" w:hAnsi="Arial" w:cs="Arial"/>
+          <w:b/>
+          <w:sz w:val="20"/>
+          <w:szCs w:val="20"/>
+        </w:rPr>
+      </w:pPr>
+    </w:p>
+    <w:p>
+      <w:pPr>
+        <w:spacing w:after="0" w:line="240" w:lineRule="auto"/>
+        <w:ind w:firstLine="720" w:firstLineChars="0"/>
+        <w:rPr>
+          <w:rFonts w:ascii="Arial" w:hAnsi="Arial" w:cs="Arial"/>
+          <w:b/>
+          <w:sz w:val="20"/>
+          <w:szCs w:val="20"/>
+        </w:rPr>
+      </w:pPr>
+      <w:r>
+        <w:rPr>
+          <w:rFonts w:ascii="Arial" w:hAnsi="Arial" w:cs="Arial"/>
+          <w:b/>
+          <w:sz w:val="20"/>
+          <w:szCs w:val="20"/>
+        </w:rPr>
+        <w:t>Fire Code Fees:</w:t>
+      </w:r>
+      <w:r>
+        <w:rPr>
+          <w:rFonts w:ascii="Arial" w:hAnsi="Arial" w:cs="Arial"/>
+          <w:b/>
+          <w:sz w:val="20"/>
+          <w:szCs w:val="20"/>
+        </w:rPr>
+        <w:tab/>
+      </w:r>
+      <w:r>
+        <w:rPr>
+          <w:rFonts w:ascii="Arial" w:hAnsi="Arial" w:cs="Arial"/>
+          <w:b/>
+          <w:sz w:val="20"/>
+          <w:szCs w:val="20"/>
+        </w:rPr>
+        <w:tab/>
+      </w:r>
+      <w:r>
+        <w:rPr>
+          <w:rFonts w:ascii="Arial" w:hAnsi="Arial" w:cs="Arial"/>
+          <w:b/>
+          <w:sz w:val="20"/>
+          <w:szCs w:val="20"/>
+        </w:rPr>
+        <w:tab/>
+      </w:r>
+      <w:r>
+        <w:rPr>
+          <w:rFonts w:ascii="Arial" w:hAnsi="Arial" w:cs="Arial"/>
+          <w:b/>
+          <w:sz w:val="20"/>
+          <w:szCs w:val="20"/>
+        </w:rPr>
+        <w:tab/>
+      </w:r>
+      <w:r>
+        <w:rPr>
+          <w:rFonts w:ascii="Arial" w:hAnsi="Arial" w:cs="Arial"/>
+          <w:b/>
+          <w:sz w:val="20"/>
+          <w:szCs w:val="20"/>
+        </w:rPr>
+        <w:tab/>
+      </w:r>
+      <w:r>
+        <w:rPr>
+          <w:rFonts w:ascii="Arial" w:hAnsi="Arial" w:cs="Arial"/>
+          <w:b/>
+          <w:sz w:val="20"/>
+          <w:szCs w:val="20"/>
+        </w:rPr>
+        <w:t xml:space="preserve">     RECOMMEND APPROVAL:</w:t>
+      </w:r>
+    </w:p>
+    <w:p>
+      <w:pPr>
+        <w:spacing w:after="0" w:line="240" w:lineRule="auto"/>
+        <w:ind w:firstLine="720" w:firstLineChars="0"/>
+        <w:rPr>
+          <w:rFonts w:ascii="Arial" w:hAnsi="Arial" w:cs="Arial"/>
+          <w:b/>
+          <w:sz w:val="20"/>
+          <w:szCs w:val="20"/>
+        </w:rPr>
+      </w:pPr>
       <w:r>
         <w:rPr>
           <w:rFonts w:ascii="Arial" w:hAnsi="Arial" w:cs="Arial"/>
@@ -7762,18 +7779,18 @@
         <mc:AlternateContent>
           <mc:Choice Requires="wps">
             <w:drawing>
-              <wp:anchor distT="0" distB="0" distL="114300" distR="114300" simplePos="0" relativeHeight="251718656" behindDoc="1" locked="0" layoutInCell="1" allowOverlap="1">
+              <wp:anchor distT="0" distB="0" distL="114300" distR="114300" simplePos="0" relativeHeight="251721728" behindDoc="1" locked="0" layoutInCell="1" allowOverlap="1">
                 <wp:simplePos x="0" y="0"/>
                 <wp:positionH relativeFrom="column">
-                  <wp:posOffset>4120515</wp:posOffset>
+                  <wp:posOffset>3057525</wp:posOffset>
                 </wp:positionH>
                 <wp:positionV relativeFrom="paragraph">
-                  <wp:posOffset>36195</wp:posOffset>
+                  <wp:posOffset>46990</wp:posOffset>
                 </wp:positionV>
                 <wp:extent cx="3061970" cy="486410"/>
                 <wp:effectExtent l="0" t="0" r="0" b="0"/>
                 <wp:wrapNone/>
-                <wp:docPr id="61" name="Text Box 61"/>
+                <wp:docPr id="65" name="Text Box 65"/>
                 <wp:cNvGraphicFramePr/>
                 <a:graphic xmlns:a="http://schemas.openxmlformats.org/drawingml/2006/main">
                   <a:graphicData uri="http://schemas.microsoft.com/office/word/2010/wordprocessingShape">
@@ -7903,7 +7920,7 @@
           </mc:Choice>
           <mc:Fallback>
             <w:pict>
-              <v:shape id="_x0000_s1026" o:spid="_x0000_s1026" o:spt="202" type="#_x0000_t202" style="position:absolute;left:0pt;margin-left:324.45pt;margin-top:2.85pt;height:38.3pt;width:241.1pt;z-index:-251597824;mso-width-relative:page;mso-height-relative:page;" filled="f" stroked="f" coordsize="21600,21600" o:gfxdata="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">
+              <v:shape id="_x0000_s1026" o:spid="_x0000_s1026" o:spt="202" type="#_x0000_t202" style="position:absolute;left:0pt;margin-left:240.75pt;margin-top:3.7pt;height:38.3pt;width:241.1pt;z-index:-251594752;mso-width-relative:page;mso-height-relative:page;" filled="f" stroked="f" coordsize="21600,21600" o:gfxdata="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">
                 <v:fill on="f" focussize="0,0"/>
                 <v:stroke on="f" weight="0.5pt"/>
                 <v:imagedata o:title=""/>
@@ -8008,16 +8025,16 @@
         <mc:AlternateContent>
           <mc:Choice Requires="wps">
             <w:drawing>
-              <wp:anchor distT="0" distB="0" distL="114300" distR="114300" simplePos="0" relativeHeight="251719680" behindDoc="0" locked="0" layoutInCell="1" allowOverlap="1">
+              <wp:anchor distT="0" distB="0" distL="114300" distR="114300" simplePos="0" relativeHeight="251722752" behindDoc="0" locked="0" layoutInCell="1" allowOverlap="1">
                 <wp:simplePos x="0" y="0"/>
                 <wp:positionH relativeFrom="column">
-                  <wp:posOffset>1210945</wp:posOffset>
+                  <wp:posOffset>781050</wp:posOffset>
                 </wp:positionH>
                 <wp:positionV relativeFrom="paragraph">
                   <wp:posOffset>147955</wp:posOffset>
                 </wp:positionV>
-                <wp:extent cx="1314450" cy="0"/>
-                <wp:effectExtent l="0" t="4445" r="0" b="5080"/>
+                <wp:extent cx="844550" cy="1905"/>
+                <wp:effectExtent l="0" t="0" r="0" b="0"/>
                 <wp:wrapNone/>
                 <wp:docPr id="1694765211" name="Straight Connector 22"/>
                 <wp:cNvGraphicFramePr/>
@@ -8028,7 +8045,7 @@
                       <wps:spPr>
                         <a:xfrm>
                           <a:off x="0" y="0"/>
-                          <a:ext cx="1314450" cy="0"/>
+                          <a:ext cx="844550" cy="1905"/>
                         </a:xfrm>
                         <a:prstGeom prst="line">
                           <a:avLst/>
@@ -8057,7 +8074,7 @@
           </mc:Choice>
           <mc:Fallback>
             <w:pict>
-              <v:line id="Straight Connector 22" o:spid="_x0000_s1026" o:spt="20" style="position:absolute;left:0pt;margin-left:95.35pt;margin-top:11.65pt;height:0pt;width:103.5pt;z-index:251719680;mso-width-relative:page;mso-height-relative:page;" filled="f" stroked="t" coordsize="21600,21600" o:gfxdata="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">
+              <v:line id="Straight Connector 22" o:spid="_x0000_s1026" o:spt="20" style="position:absolute;left:0pt;margin-left:61.5pt;margin-top:11.65pt;height:0.15pt;width:66.5pt;z-index:251722752;mso-width-relative:page;mso-height-relative:page;" filled="f" stroked="t" coordsize="21600,21600" o:gfxdata="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">
                 <v:fill on="f" focussize="0,0"/>
                 <v:stroke color="#000000 [3200]" joinstyle="round"/>
                 <v:imagedata o:title=""/>
@@ -8140,14 +8157,6 @@
           <w:sz w:val="20"/>
           <w:szCs w:val="20"/>
         </w:rPr>
-        <w:tab/>
-      </w:r>
-      <w:r>
-        <w:rPr>
-          <w:rFonts w:ascii="Arial" w:hAnsi="Arial" w:cs="Arial"/>
-          <w:sz w:val="20"/>
-          <w:szCs w:val="20"/>
-        </w:rPr>
         <w:t xml:space="preserve"> </w:t>
       </w:r>
     </w:p>
@@ -8171,18 +8180,18 @@
         <mc:AlternateContent>
           <mc:Choice Requires="wps">
             <w:drawing>
-              <wp:anchor distT="0" distB="0" distL="114300" distR="114300" simplePos="0" relativeHeight="251722752" behindDoc="0" locked="0" layoutInCell="1" allowOverlap="1">
+              <wp:anchor distT="0" distB="0" distL="114300" distR="114300" simplePos="0" relativeHeight="251724800" behindDoc="0" locked="0" layoutInCell="1" allowOverlap="1">
                 <wp:simplePos x="0" y="0"/>
                 <wp:positionH relativeFrom="column">
-                  <wp:posOffset>4433570</wp:posOffset>
+                  <wp:posOffset>3418840</wp:posOffset>
                 </wp:positionH>
                 <wp:positionV relativeFrom="paragraph">
-                  <wp:posOffset>85090</wp:posOffset>
+                  <wp:posOffset>78740</wp:posOffset>
                 </wp:positionV>
                 <wp:extent cx="2308225" cy="10795"/>
                 <wp:effectExtent l="0" t="4445" r="15875" b="13335"/>
                 <wp:wrapNone/>
-                <wp:docPr id="62" name="Straight Connector 22"/>
+                <wp:docPr id="66" name="Straight Connector 22"/>
                 <wp:cNvGraphicFramePr/>
                 <a:graphic xmlns:a="http://schemas.openxmlformats.org/drawingml/2006/main">
                   <a:graphicData uri="http://schemas.microsoft.com/office/word/2010/wordprocessingShape">
@@ -8220,7 +8229,7 @@
           </mc:Choice>
           <mc:Fallback>
             <w:pict>
-              <v:line id="Straight Connector 22" o:spid="_x0000_s1026" o:spt="20" style="position:absolute;left:0pt;flip:y;margin-left:349.1pt;margin-top:6.7pt;height:0.85pt;width:181.75pt;z-index:251722752;mso-width-relative:page;mso-height-relative:page;" filled="f" stroked="t" coordsize="21600,21600" o:gfxdata="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">
+              <v:line id="Straight Connector 22" o:spid="_x0000_s1026" o:spt="20" style="position:absolute;left:0pt;flip:y;margin-left:269.2pt;margin-top:6.2pt;height:0.85pt;width:181.75pt;z-index:251724800;mso-width-relative:page;mso-height-relative:page;" filled="f" stroked="t" coordsize="21600,21600" o:gfxdata="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">
                 <v:fill on="f" focussize="0,0"/>
                 <v:stroke color="#000000 [3200]" joinstyle="round"/>
                 <v:imagedata o:title=""/>
@@ -8240,16 +8249,16 @@
         <mc:AlternateContent>
           <mc:Choice Requires="wps">
             <w:drawing>
-              <wp:anchor distT="0" distB="0" distL="114300" distR="114300" simplePos="0" relativeHeight="251720704" behindDoc="0" locked="0" layoutInCell="1" allowOverlap="1">
+              <wp:anchor distT="0" distB="0" distL="114300" distR="114300" simplePos="0" relativeHeight="251723776" behindDoc="0" locked="0" layoutInCell="1" allowOverlap="1">
                 <wp:simplePos x="0" y="0"/>
                 <wp:positionH relativeFrom="column">
-                  <wp:posOffset>735330</wp:posOffset>
+                  <wp:posOffset>781050</wp:posOffset>
                 </wp:positionH>
                 <wp:positionV relativeFrom="paragraph">
                   <wp:posOffset>146050</wp:posOffset>
                 </wp:positionV>
-                <wp:extent cx="1314450" cy="0"/>
-                <wp:effectExtent l="0" t="4445" r="0" b="5080"/>
+                <wp:extent cx="945515" cy="5715"/>
+                <wp:effectExtent l="0" t="0" r="0" b="0"/>
                 <wp:wrapNone/>
                 <wp:docPr id="1094408323" name="Straight Connector 22"/>
                 <wp:cNvGraphicFramePr/>
@@ -8260,7 +8269,7 @@
                       <wps:spPr>
                         <a:xfrm>
                           <a:off x="0" y="0"/>
-                          <a:ext cx="1314450" cy="0"/>
+                          <a:ext cx="945515" cy="5715"/>
                         </a:xfrm>
                         <a:prstGeom prst="line">
                           <a:avLst/>
@@ -8289,7 +8298,7 @@
           </mc:Choice>
           <mc:Fallback>
             <w:pict>
-              <v:line id="Straight Connector 22" o:spid="_x0000_s1026" o:spt="20" style="position:absolute;left:0pt;margin-left:57.9pt;margin-top:11.5pt;height:0pt;width:103.5pt;z-index:251720704;mso-width-relative:page;mso-height-relative:page;" filled="f" stroked="t" coordsize="21600,21600" o:gfxdata="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">
+              <v:line id="Straight Connector 22" o:spid="_x0000_s1026" o:spt="20" style="position:absolute;left:0pt;margin-left:61.5pt;margin-top:11.5pt;height:0.45pt;width:74.45pt;z-index:251723776;mso-width-relative:page;mso-height-relative:page;" filled="f" stroked="t" coordsize="21600,21600" o:gfxdata="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">
                 <v:fill on="f" focussize="0,0"/>
                 <v:stroke color="#000000 [3200]" joinstyle="round"/>
                 <v:imagedata o:title=""/>
@@ -8472,22 +8481,6 @@
           <w:sz w:val="20"/>
           <w:szCs w:val="20"/>
         </w:rPr>
-        <w:tab/>
-      </w:r>
-      <w:r>
-        <w:rPr>
-          <w:rFonts w:ascii="Arial" w:hAnsi="Arial" w:cs="Arial"/>
-          <w:sz w:val="20"/>
-          <w:szCs w:val="20"/>
-        </w:rPr>
-        <w:tab/>
-      </w:r>
-      <w:r>
-        <w:rPr>
-          <w:rFonts w:ascii="Arial" w:hAnsi="Arial" w:cs="Arial"/>
-          <w:sz w:val="20"/>
-          <w:szCs w:val="20"/>
-        </w:rPr>
         <w:t xml:space="preserve">   </w:t>
       </w:r>
     </w:p>
@@ -8509,7 +8502,7 @@
         <mc:AlternateContent>
           <mc:Choice Requires="wps">
             <w:drawing>
-              <wp:anchor distT="0" distB="0" distL="114300" distR="114300" simplePos="0" relativeHeight="251721728" behindDoc="0" locked="0" layoutInCell="1" allowOverlap="1">
+              <wp:anchor distT="0" distB="0" distL="114300" distR="114300" simplePos="0" relativeHeight="251718656" behindDoc="0" locked="0" layoutInCell="1" allowOverlap="1">
                 <wp:simplePos x="0" y="0"/>
                 <wp:positionH relativeFrom="column">
                   <wp:posOffset>765810</wp:posOffset>
@@ -8558,7 +8551,7 @@
           </mc:Choice>
           <mc:Fallback>
             <w:pict>
-              <v:line id="Straight Connector 22" o:spid="_x0000_s1026" o:spt="20" style="position:absolute;left:0pt;margin-left:60.3pt;margin-top:0.1pt;height:0pt;width:103.5pt;z-index:251721728;mso-width-relative:page;mso-height-relative:page;" filled="f" stroked="t" coordsize="21600,21600" o:gfxdata="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">
+              <v:line id="Straight Connector 22" o:spid="_x0000_s1026" o:spt="20" style="position:absolute;left:0pt;margin-left:60.3pt;margin-top:0.1pt;height:0pt;width:103.5pt;z-index:251718656;mso-width-relative:page;mso-height-relative:page;" filled="f" stroked="t" coordsize="21600,21600" o:gfxdata="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">
                 <v:fill on="f" focussize="0,0"/>
                 <v:stroke color="#000000 [3200]" joinstyle="round"/>
                 <v:imagedata o:title=""/>
@@ -9041,8 +9034,6 @@
           <w:rFonts w:ascii="Arial Narrow" w:hAnsi="Arial Narrow" w:cs="Arial"/>
         </w:rPr>
       </w:pPr>
-      <w:bookmarkStart w:id="0" w:name="_GoBack"/>
-      <w:bookmarkEnd w:id="0"/>
     </w:p>
     <w:p>
       <w:pPr>

</xml_diff>

<commit_message>
templates adjustment and marshal position added
</commit_message>
<xml_diff>
--- a/backend/templates/FSED-34F-Hot-Works.docx
+++ b/backend/templates/FSED-34F-Hot-Works.docx
@@ -485,15 +485,15 @@
               <wp:anchor distT="0" distB="0" distL="114300" distR="114300" simplePos="0" relativeHeight="251723776" behindDoc="0" locked="0" layoutInCell="1" allowOverlap="1">
                 <wp:simplePos x="0" y="0"/>
                 <wp:positionH relativeFrom="column">
-                  <wp:posOffset>1513205</wp:posOffset>
+                  <wp:posOffset>1528445</wp:posOffset>
                 </wp:positionH>
                 <wp:positionV relativeFrom="paragraph">
-                  <wp:posOffset>194310</wp:posOffset>
+                  <wp:posOffset>191135</wp:posOffset>
                 </wp:positionV>
-                <wp:extent cx="742315" cy="2540"/>
-                <wp:effectExtent l="0" t="0" r="0" b="0"/>
+                <wp:extent cx="1668780" cy="10160"/>
+                <wp:effectExtent l="0" t="4445" r="7620" b="13970"/>
                 <wp:wrapNone/>
-                <wp:docPr id="59" name="Straight Connector 59"/>
+                <wp:docPr id="49" name="Straight Connector 49"/>
                 <wp:cNvGraphicFramePr/>
                 <a:graphic xmlns:a="http://schemas.openxmlformats.org/drawingml/2006/main">
                   <a:graphicData uri="http://schemas.microsoft.com/office/word/2010/wordprocessingShape">
@@ -502,7 +502,7 @@
                       <wps:spPr>
                         <a:xfrm>
                           <a:off x="0" y="0"/>
-                          <a:ext cx="742315" cy="2540"/>
+                          <a:ext cx="1668780" cy="10160"/>
                         </a:xfrm>
                         <a:prstGeom prst="line">
                           <a:avLst/>
@@ -531,7 +531,7 @@
           </mc:Choice>
           <mc:Fallback>
             <w:pict>
-              <v:line id="_x0000_s1026" o:spid="_x0000_s1026" o:spt="20" style="position:absolute;left:0pt;margin-left:119.15pt;margin-top:15.3pt;height:0.2pt;width:58.45pt;z-index:251723776;mso-width-relative:page;mso-height-relative:page;" filled="f" stroked="t" coordsize="21600,21600" o:gfxdata="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">
+              <v:line id="_x0000_s1026" o:spid="_x0000_s1026" o:spt="20" style="position:absolute;left:0pt;margin-left:120.35pt;margin-top:15.05pt;height:0.8pt;width:131.4pt;z-index:251723776;mso-width-relative:page;mso-height-relative:page;" filled="f" stroked="t" coordsize="21600,21600" o:gfxdata="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">
                 <v:fill on="f" focussize="0,0"/>
                 <v:stroke color="#000000 [3200]" joinstyle="round"/>
                 <v:imagedata o:title=""/>
@@ -637,7 +637,7 @@
           <w:szCs w:val="28"/>
           <w:lang w:val="en-US"/>
         </w:rPr>
-        <w:t>R10-COFD</w:t>
+        <w:t>R10-COFD-</w:t>
       </w:r>
       <w:r>
         <w:rPr>
@@ -1876,17 +1876,7 @@
                 <w:sz w:val="18"/>
                 <w:szCs w:val="18"/>
               </w:rPr>
-              <w:t>BEFORE INITIATING HOT WORK, ENSURE PRECAUTIO</w:t>
-            </w:r>
-            <w:bookmarkStart w:id="0" w:name="_GoBack"/>
-            <w:bookmarkEnd w:id="0"/>
-            <w:r>
-              <w:rPr>
-                <w:rFonts w:ascii="Arial" w:hAnsi="Arial" w:cs="Arial"/>
-                <w:sz w:val="18"/>
-                <w:szCs w:val="18"/>
-              </w:rPr>
-              <w:t>N ARE IN PLACE!</w:t>
+              <w:t>BEFORE INITIATING HOT WORK, ENSURE PRECAUTION ARE IN PLACE!</w:t>
             </w:r>
           </w:p>
           <w:p>
@@ -8545,45 +8535,6 @@
         </w:rPr>
         <w:tab/>
       </w:r>
-      <w:r>
-        <w:rPr>
-          <w:rFonts w:ascii="Arial Narrow" w:hAnsi="Arial Narrow" w:cs="Arial"/>
-        </w:rPr>
-        <w:tab/>
-      </w:r>
-      <w:r>
-        <w:rPr>
-          <w:rFonts w:ascii="Arial Narrow" w:hAnsi="Arial Narrow" w:cs="Arial"/>
-        </w:rPr>
-        <w:tab/>
-      </w:r>
-      <w:r>
-        <w:rPr>
-          <w:rFonts w:ascii="Arial Narrow" w:hAnsi="Arial Narrow" w:cs="Arial"/>
-        </w:rPr>
-        <w:t xml:space="preserve">   </w:t>
-      </w:r>
-      <w:r>
-        <w:rPr>
-          <w:rFonts w:hint="default" w:ascii="Arial Narrow" w:hAnsi="Arial Narrow" w:cs="Arial"/>
-          <w:lang w:val="en-US"/>
-        </w:rPr>
-        <w:tab/>
-      </w:r>
-      <w:r>
-        <w:rPr>
-          <w:rFonts w:hint="default" w:ascii="Arial Narrow" w:hAnsi="Arial Narrow" w:cs="Arial"/>
-          <w:lang w:val="en-US"/>
-        </w:rPr>
-        <w:tab/>
-      </w:r>
-      <w:r>
-        <w:rPr>
-          <w:rFonts w:hint="default" w:ascii="Arial Narrow" w:hAnsi="Arial Narrow" w:cs="Arial"/>
-          <w:lang w:val="en-US"/>
-        </w:rPr>
-        <w:tab/>
-      </w:r>
     </w:p>
     <w:p>
       <w:pPr>
@@ -8656,6 +8607,8 @@
         </w:rPr>
         <w:t xml:space="preserve"> </w:t>
       </w:r>
+      <w:bookmarkStart w:id="0" w:name="_GoBack"/>
+      <w:bookmarkEnd w:id="0"/>
     </w:p>
     <w:p>
       <w:pPr>
@@ -8877,11 +8830,12 @@
         <w:spacing w:after="0" w:line="240" w:lineRule="auto"/>
         <w:ind w:left="720" w:leftChars="0" w:firstLine="720" w:firstLineChars="0"/>
         <w:rPr>
-          <w:rFonts w:ascii="Arial" w:hAnsi="Arial" w:cs="Arial"/>
+          <w:rFonts w:hint="default" w:ascii="Arial" w:hAnsi="Arial" w:cs="Arial"/>
           <w:b/>
           <w:bCs/>
           <w:sz w:val="20"/>
           <w:szCs w:val="20"/>
+          <w:lang w:val="en-US"/>
         </w:rPr>
       </w:pPr>
       <w:r>
@@ -8894,13 +8848,12 @@
       </w:r>
       <w:r>
         <w:rPr>
-          <w:rFonts w:ascii="Arial" w:hAnsi="Arial" w:cs="Arial"/>
+          <w:rFonts w:hint="default" w:ascii="Arial Narrow" w:hAnsi="Arial Narrow" w:cs="Arial"/>
           <w:b/>
           <w:bCs/>
-          <w:sz w:val="20"/>
-          <w:szCs w:val="20"/>
-        </w:rPr>
-        <w:t>CITY/MUNICIPAL FIRE MARSHAL</w:t>
+          <w:lang w:val="en-US"/>
+        </w:rPr>
+        <w:t>{MARSHAL_POSITION}</w:t>
       </w:r>
     </w:p>
     <w:p>

</xml_diff>

<commit_message>
template adjustment update on marshal position
</commit_message>
<xml_diff>
--- a/backend/templates/FSED-34F-Hot-Works.docx
+++ b/backend/templates/FSED-34F-Hot-Works.docx
@@ -7703,7 +7703,7 @@
                                 <w:szCs w:val="20"/>
                                 <w:lang w:val="en-US"/>
                               </w:rPr>
-                              <w:t>(</w:t>
+                              <w:t>{</w:t>
                             </w:r>
                             <w:r>
                               <w:rPr>
@@ -7827,7 +7827,7 @@
                           <w:szCs w:val="20"/>
                           <w:lang w:val="en-US"/>
                         </w:rPr>
-                        <w:t>(</w:t>
+                        <w:t>{</w:t>
                       </w:r>
                       <w:r>
                         <w:rPr>
@@ -8581,6 +8581,8 @@
         </w:rPr>
         <w:tab/>
       </w:r>
+      <w:bookmarkStart w:id="0" w:name="_GoBack"/>
+      <w:bookmarkEnd w:id="0"/>
       <w:r>
         <w:rPr>
           <w:rFonts w:ascii="Arial Narrow" w:hAnsi="Arial Narrow" w:cs="Arial"/>
@@ -8607,8 +8609,6 @@
         </w:rPr>
         <w:t xml:space="preserve"> </w:t>
       </w:r>
-      <w:bookmarkStart w:id="0" w:name="_GoBack"/>
-      <w:bookmarkEnd w:id="0"/>
     </w:p>
     <w:p>
       <w:pPr>
@@ -8853,7 +8853,7 @@
           <w:bCs/>
           <w:lang w:val="en-US"/>
         </w:rPr>
-        <w:t>{MARSHAL_POSITION}</w:t>
+        <w:t xml:space="preserve">       {MARSHAL_POSITION}</w:t>
       </w:r>
     </w:p>
     <w:p>

</xml_diff>